<commit_message>
update report theo tuần
</commit_message>
<xml_diff>
--- a/Báo Cáo Tiến Độ Project.Trang.docx
+++ b/Báo Cáo Tiến Độ Project.Trang.docx
@@ -4605,6 +4605,627 @@
         <w:numPr>
           <w:ilvl w:val="0"/>
           <w:numId w:val="59"/>
+        </w:numPr>
+        <w:rPr>
+          <w:rFonts w:asciiTheme="majorHAnsi" w:hAnsiTheme="majorHAnsi" w:cstheme="majorHAnsi"/>
+        </w:rPr>
+      </w:pPr>
+      <w:r>
+        <w:rPr>
+          <w:rFonts w:asciiTheme="majorHAnsi" w:hAnsiTheme="majorHAnsi" w:cstheme="majorHAnsi"/>
+        </w:rPr>
+        <w:t>Chuẩn bị slide báo cáo và kịch bản thuyết trình chi tiết về Module Parent để sẵn sàng cho buổi bảo vệ dự án trước lớp.</w:t>
+      </w:r>
+    </w:p>
+    <w:p>
+      <w:pPr>
+        <w:rPr>
+          <w:rFonts w:asciiTheme="majorHAnsi" w:hAnsiTheme="majorHAnsi" w:cstheme="majorHAnsi"/>
+        </w:rPr>
+      </w:pPr>
+      <w:r>
+        <w:rPr>
+          <w:rFonts w:asciiTheme="majorHAnsi" w:hAnsiTheme="majorHAnsi" w:cstheme="majorHAnsi"/>
+          <w:b/>
+          <w:bCs/>
+        </w:rPr>
+        <w:t>6. Xử lý các vấn đề kỹ thuật phát sinh trong tuần 3</w:t>
+      </w:r>
+    </w:p>
+    <w:p>
+      <w:pPr>
+        <w:numPr>
+          <w:ilvl w:val="0"/>
+          <w:numId w:val="60"/>
+        </w:numPr>
+        <w:rPr>
+          <w:rFonts w:asciiTheme="majorHAnsi" w:hAnsiTheme="majorHAnsi" w:cstheme="majorHAnsi"/>
+        </w:rPr>
+      </w:pPr>
+      <w:r>
+        <w:rPr>
+          <w:rFonts w:asciiTheme="majorHAnsi" w:hAnsiTheme="majorHAnsi" w:cstheme="majorHAnsi"/>
+          <w:b/>
+          <w:bCs/>
+        </w:rPr>
+        <w:t>Lỗi Font tiếng Việt (Unicode):</w:t>
+      </w:r>
+      <w:r>
+        <w:rPr>
+          <w:rFonts w:asciiTheme="majorHAnsi" w:hAnsiTheme="majorHAnsi" w:cstheme="majorHAnsi"/>
+        </w:rPr>
+        <w:t xml:space="preserve"> Khi phụ huynh gửi phản hồi (Feedback), dữ liệu tiếng Việt có dấu bị lỗi hiển thị thành ký tự lạ hoặc dấu hỏi ??? trong cơ sở dữ liệu. Nhóm </w:t>
+      </w:r>
+      <w:r>
+        <w:rPr>
+          <w:rFonts w:asciiTheme="majorHAnsi" w:hAnsiTheme="majorHAnsi" w:cstheme="majorHAnsi"/>
+        </w:rPr>
+        <w:lastRenderedPageBreak/>
+        <w:t xml:space="preserve">đã khắc phục bằng cách thêm bộ lọc request.setCharacterEncoding("UTF-8") vào đầu hàm doPost của FeedbackServlet và cấu hình lại encoding trên các trang JSP. </w:t>
+      </w:r>
+    </w:p>
+    <w:p>
+      <w:pPr>
+        <w:numPr>
+          <w:ilvl w:val="0"/>
+          <w:numId w:val="60"/>
+        </w:numPr>
+        <w:rPr>
+          <w:rFonts w:asciiTheme="majorHAnsi" w:hAnsiTheme="majorHAnsi" w:cstheme="majorHAnsi"/>
+        </w:rPr>
+      </w:pPr>
+      <w:r>
+        <w:rPr>
+          <w:rFonts w:asciiTheme="majorHAnsi" w:hAnsiTheme="majorHAnsi" w:cstheme="majorHAnsi"/>
+          <w:b/>
+          <w:bCs/>
+        </w:rPr>
+        <w:t>Xử lý dữ liệu trống (Validation):</w:t>
+      </w:r>
+      <w:r>
+        <w:rPr>
+          <w:rFonts w:asciiTheme="majorHAnsi" w:hAnsiTheme="majorHAnsi" w:cstheme="majorHAnsi"/>
+        </w:rPr>
+        <w:t xml:space="preserve"> Tránh trường hợp phụ huynh nhấn gửi form phản hồi trống hoặc nhập ký tự đặc biệt phá hỏng giao diện. Nhóm đã tích hợp cả Javasript Validation ở phía Client (trên file feedback.jsp) và kiểm tra chuỗi rỗng ở phía Server (trong FeedbackServlet).</w:t>
+      </w:r>
+    </w:p>
+    <w:p>
+      <w:pPr>
+        <w:numPr>
+          <w:ilvl w:val="0"/>
+          <w:numId w:val="60"/>
+        </w:numPr>
+        <w:rPr>
+          <w:rFonts w:asciiTheme="majorHAnsi" w:hAnsiTheme="majorHAnsi" w:cstheme="majorHAnsi"/>
+        </w:rPr>
+      </w:pPr>
+      <w:r>
+        <w:rPr>
+          <w:rFonts w:asciiTheme="majorHAnsi" w:hAnsiTheme="majorHAnsi" w:cstheme="majorHAnsi"/>
+          <w:b/>
+          <w:bCs/>
+        </w:rPr>
+        <w:t>Tối ưu hóa hiệu năng danh sách thông báo:</w:t>
+      </w:r>
+      <w:r>
+        <w:rPr>
+          <w:rFonts w:asciiTheme="majorHAnsi" w:hAnsiTheme="majorHAnsi" w:cstheme="majorHAnsi"/>
+        </w:rPr>
+        <w:t xml:space="preserve"> Khi số lượng thông báo từ Admin tăng lên, việc load toàn bộ dữ liệu sẽ gây chậm hệ thống. Nhóm đã tinh chỉnh câu lệnh SQL trong NotificationDAO để sắp xếp theo created_at DESC nhằm luôn hiển thị thông báo mới nhất lên đầu. </w:t>
+      </w:r>
+    </w:p>
+    <w:p>
+      <w:pPr>
+        <w:rPr>
+          <w:rFonts w:asciiTheme="majorHAnsi" w:hAnsiTheme="majorHAnsi" w:cstheme="majorHAnsi"/>
+        </w:rPr>
+      </w:pPr>
+      <w:r>
+        <w:rPr>
+          <w:rFonts w:asciiTheme="majorHAnsi" w:hAnsiTheme="majorHAnsi" w:cstheme="majorHAnsi"/>
+          <w:b/>
+          <w:bCs/>
+        </w:rPr>
+        <w:t>7. Kết quả cuối tuần 3</w:t>
+      </w:r>
+    </w:p>
+    <w:p>
+      <w:pPr>
+        <w:numPr>
+          <w:ilvl w:val="0"/>
+          <w:numId w:val="61"/>
+        </w:numPr>
+        <w:rPr>
+          <w:rFonts w:asciiTheme="majorHAnsi" w:hAnsiTheme="majorHAnsi" w:cstheme="majorHAnsi"/>
+        </w:rPr>
+      </w:pPr>
+      <w:r>
+        <w:rPr>
+          <w:rFonts w:asciiTheme="majorHAnsi" w:hAnsiTheme="majorHAnsi" w:cstheme="majorHAnsi"/>
+        </w:rPr>
+        <w:t xml:space="preserve">Phụ huynh đã có thể trải nghiệm mượt mà các tính năng cốt lõi: Nhận thông báo hệ thống , gửi ý kiến phản hồi về nhà trường , và xem thông tin chuyến xe cơ bản của con em mình. </w:t>
+      </w:r>
+    </w:p>
+    <w:p>
+      <w:pPr>
+        <w:numPr>
+          <w:ilvl w:val="0"/>
+          <w:numId w:val="61"/>
+        </w:numPr>
+        <w:rPr>
+          <w:rFonts w:asciiTheme="majorHAnsi" w:hAnsiTheme="majorHAnsi" w:cstheme="majorHAnsi"/>
+        </w:rPr>
+      </w:pPr>
+      <w:r>
+        <w:rPr>
+          <w:rFonts w:asciiTheme="majorHAnsi" w:hAnsiTheme="majorHAnsi" w:cstheme="majorHAnsi"/>
+        </w:rPr>
+        <w:t xml:space="preserve">Hệ thống cơ sở dữ liệu hoạt động ổn định, các kết nối qua DBContext được đóng/ngắt đúng quy trình để tránh tràn bộ nhớ (Connection Leak). </w:t>
+      </w:r>
+    </w:p>
+    <w:p>
+      <w:pPr>
+        <w:rPr>
+          <w:rFonts w:asciiTheme="majorHAnsi" w:hAnsiTheme="majorHAnsi" w:cstheme="majorHAnsi"/>
+          <w:b/>
+          <w:bCs/>
+          <w:sz w:val="28"/>
+          <w:szCs w:val="28"/>
+        </w:rPr>
+      </w:pPr>
+      <w:r>
+        <w:rPr>
+          <w:rFonts w:asciiTheme="majorHAnsi" w:hAnsiTheme="majorHAnsi" w:cstheme="majorHAnsi"/>
+          <w:b/>
+          <w:bCs/>
+          <w:sz w:val="28"/>
+          <w:szCs w:val="28"/>
+        </w:rPr>
+        <w:t>TUẦN 4: Triển khai chức năng nâng cao, Bảo mật và Tích hợp hệ thống</w:t>
+      </w:r>
+    </w:p>
+    <w:p>
+      <w:pPr>
+        <w:rPr>
+          <w:rFonts w:asciiTheme="majorHAnsi" w:hAnsiTheme="majorHAnsi" w:cstheme="majorHAnsi"/>
+        </w:rPr>
+      </w:pPr>
+      <w:r>
+        <w:rPr>
+          <w:rFonts w:asciiTheme="majorHAnsi" w:hAnsiTheme="majorHAnsi" w:cstheme="majorHAnsi"/>
+          <w:b/>
+          <w:bCs/>
+        </w:rPr>
+        <w:t>1. Xây dựng chức năng Đăng ký nghỉ học (Submit Absence Requests)</w:t>
+      </w:r>
+    </w:p>
+    <w:p>
+      <w:pPr>
+        <w:numPr>
+          <w:ilvl w:val="0"/>
+          <w:numId w:val="62"/>
+        </w:numPr>
+        <w:rPr>
+          <w:rFonts w:asciiTheme="majorHAnsi" w:hAnsiTheme="majorHAnsi" w:cstheme="majorHAnsi"/>
+        </w:rPr>
+      </w:pPr>
+      <w:r>
+        <w:rPr>
+          <w:rFonts w:asciiTheme="majorHAnsi" w:hAnsiTheme="majorHAnsi" w:cstheme="majorHAnsi"/>
+        </w:rPr>
+        <w:t>Để hoàn thiện toàn bộ các tính năng đề ra trong Module Parent, nhóm tiến hành xây dựng chức năng cho phép phụ huynh chủ động xin nghỉ học và nghỉ xe buýt cho con.</w:t>
+      </w:r>
+    </w:p>
+    <w:p>
+      <w:pPr>
+        <w:numPr>
+          <w:ilvl w:val="0"/>
+          <w:numId w:val="62"/>
+        </w:numPr>
+        <w:rPr>
+          <w:rFonts w:asciiTheme="majorHAnsi" w:hAnsiTheme="majorHAnsi" w:cstheme="majorHAnsi"/>
+        </w:rPr>
+      </w:pPr>
+      <w:r>
+        <w:rPr>
+          <w:rFonts w:asciiTheme="majorHAnsi" w:hAnsiTheme="majorHAnsi" w:cstheme="majorHAnsi"/>
+          <w:b/>
+          <w:bCs/>
+        </w:rPr>
+        <w:t>Thiết kế cơ sở dữ liệu:</w:t>
+      </w:r>
+      <w:r>
+        <w:rPr>
+          <w:rFonts w:asciiTheme="majorHAnsi" w:hAnsiTheme="majorHAnsi" w:cstheme="majorHAnsi"/>
+        </w:rPr>
+        <w:t xml:space="preserve"> Tạo thêm bảng leave_requests kết nối với bảng students qua khóa ngoại student_id. Bảng bao gồm các trường: id (PK), student_id (FK), leave_date, reason, status (mặc định là 'Pending' khi mới tạo).</w:t>
+      </w:r>
+    </w:p>
+    <w:p>
+      <w:pPr>
+        <w:numPr>
+          <w:ilvl w:val="0"/>
+          <w:numId w:val="62"/>
+        </w:numPr>
+        <w:rPr>
+          <w:rFonts w:asciiTheme="majorHAnsi" w:hAnsiTheme="majorHAnsi" w:cstheme="majorHAnsi"/>
+        </w:rPr>
+      </w:pPr>
+      <w:r>
+        <w:rPr>
+          <w:rFonts w:asciiTheme="majorHAnsi" w:hAnsiTheme="majorHAnsi" w:cstheme="majorHAnsi"/>
+          <w:b/>
+          <w:bCs/>
+        </w:rPr>
+        <w:t>Xây dựng Backend:</w:t>
+      </w:r>
+      <w:r>
+        <w:rPr>
+          <w:rFonts w:asciiTheme="majorHAnsi" w:hAnsiTheme="majorHAnsi" w:cstheme="majorHAnsi"/>
+        </w:rPr>
+        <w:t xml:space="preserve"> * Triển khai lớp LeaveRequestDAO chứa hàm insertLeaveRequest() để lưu đơn xuống DB và hàm getLeaveRequestsByStudent() để lấy lịch sử xin nghỉ của học sinh.</w:t>
+      </w:r>
+    </w:p>
+    <w:p>
+      <w:pPr>
+        <w:numPr>
+          <w:ilvl w:val="1"/>
+          <w:numId w:val="62"/>
+        </w:numPr>
+        <w:rPr>
+          <w:rFonts w:asciiTheme="majorHAnsi" w:hAnsiTheme="majorHAnsi" w:cstheme="majorHAnsi"/>
+        </w:rPr>
+      </w:pPr>
+      <w:r>
+        <w:rPr>
+          <w:rFonts w:asciiTheme="majorHAnsi" w:hAnsiTheme="majorHAnsi" w:cstheme="majorHAnsi"/>
+        </w:rPr>
+        <w:t>Triển khai LeaveRequestServlet thuộc package controllerparent. Servlet chịu trách nhiệm điều hướng: nhận yêu cầu tải trang (doGet), nhận dữ liệu từ form xin nghỉ (doPost) và đẩy dữ liệu về database.</w:t>
+      </w:r>
+    </w:p>
+    <w:p>
+      <w:pPr>
+        <w:numPr>
+          <w:ilvl w:val="0"/>
+          <w:numId w:val="62"/>
+        </w:numPr>
+        <w:rPr>
+          <w:rFonts w:asciiTheme="majorHAnsi" w:hAnsiTheme="majorHAnsi" w:cstheme="majorHAnsi"/>
+        </w:rPr>
+      </w:pPr>
+      <w:r>
+        <w:rPr>
+          <w:rFonts w:asciiTheme="majorHAnsi" w:hAnsiTheme="majorHAnsi" w:cstheme="majorHAnsi"/>
+          <w:b/>
+          <w:bCs/>
+        </w:rPr>
+        <w:t>Hoàn thiện giao diện (leave-request.jsp):</w:t>
+      </w:r>
+      <w:r>
+        <w:rPr>
+          <w:rFonts w:asciiTheme="majorHAnsi" w:hAnsiTheme="majorHAnsi" w:cstheme="majorHAnsi"/>
+        </w:rPr>
+        <w:t xml:space="preserve"> Áp dụng Bootstrap 5 để chia bố cục trang làm 2 phần trực quan. Khung bên trái là form nhập dữ liệu (Ngày nghỉ, Lý do nghỉ); khung bên phải là bảng hiển thị lịch sử kèm các badge màu sắc động tương ứng với trạng thái đơn (Màu vàng: Chờ duyệt, Màu xanh: Đã chấp nhận, Màu đỏ: Từ chối).</w:t>
+      </w:r>
+    </w:p>
+    <w:p>
+      <w:pPr>
+        <w:rPr>
+          <w:rFonts w:asciiTheme="majorHAnsi" w:hAnsiTheme="majorHAnsi" w:cstheme="majorHAnsi"/>
+        </w:rPr>
+      </w:pPr>
+      <w:r>
+        <w:rPr>
+          <w:rFonts w:asciiTheme="majorHAnsi" w:hAnsiTheme="majorHAnsi" w:cstheme="majorHAnsi"/>
+          <w:b/>
+          <w:bCs/>
+        </w:rPr>
+        <w:t>2. Nâng cấp chức năng Theo dõi lộ trình (Track Transportation)</w:t>
+      </w:r>
+    </w:p>
+    <w:p>
+      <w:pPr>
+        <w:numPr>
+          <w:ilvl w:val="0"/>
+          <w:numId w:val="63"/>
+        </w:numPr>
+        <w:rPr>
+          <w:rFonts w:asciiTheme="majorHAnsi" w:hAnsiTheme="majorHAnsi" w:cstheme="majorHAnsi"/>
+        </w:rPr>
+      </w:pPr>
+      <w:r>
+        <w:rPr>
+          <w:rFonts w:asciiTheme="majorHAnsi" w:hAnsiTheme="majorHAnsi" w:cstheme="majorHAnsi"/>
+        </w:rPr>
+        <w:t xml:space="preserve">Dựa trên nền tảng hiển thị text ở tuần 3, nhóm tiến hành nâng cấp giao diện tracking.jsp. </w:t>
+      </w:r>
+    </w:p>
+    <w:p>
+      <w:pPr>
+        <w:numPr>
+          <w:ilvl w:val="0"/>
+          <w:numId w:val="63"/>
+        </w:numPr>
+        <w:rPr>
+          <w:rFonts w:asciiTheme="majorHAnsi" w:hAnsiTheme="majorHAnsi" w:cstheme="majorHAnsi"/>
+        </w:rPr>
+      </w:pPr>
+      <w:r>
+        <w:rPr>
+          <w:rFonts w:asciiTheme="majorHAnsi" w:hAnsiTheme="majorHAnsi" w:cstheme="majorHAnsi"/>
+          <w:b/>
+          <w:bCs/>
+        </w:rPr>
+        <w:lastRenderedPageBreak/>
+        <w:t>Tích hợp giao diện trực quan:</w:t>
+      </w:r>
+      <w:r>
+        <w:rPr>
+          <w:rFonts w:asciiTheme="majorHAnsi" w:hAnsiTheme="majorHAnsi" w:cstheme="majorHAnsi"/>
+        </w:rPr>
+        <w:t xml:space="preserve"> Nhóm thiết kế một vùng không gian lớn trên giao diện để giả lập Bản đồ lộ trình (sử dụng các thẻ chứa bản đồ hoặc mockup bản đồ số).</w:t>
+      </w:r>
+    </w:p>
+    <w:p>
+      <w:pPr>
+        <w:numPr>
+          <w:ilvl w:val="0"/>
+          <w:numId w:val="63"/>
+        </w:numPr>
+        <w:rPr>
+          <w:rFonts w:asciiTheme="majorHAnsi" w:hAnsiTheme="majorHAnsi" w:cstheme="majorHAnsi"/>
+        </w:rPr>
+      </w:pPr>
+      <w:r>
+        <w:rPr>
+          <w:rFonts w:asciiTheme="majorHAnsi" w:hAnsiTheme="majorHAnsi" w:cstheme="majorHAnsi"/>
+          <w:b/>
+          <w:bCs/>
+        </w:rPr>
+        <w:t>Đồng bộ dữ liệu trạng thái:</w:t>
+      </w:r>
+      <w:r>
+        <w:rPr>
+          <w:rFonts w:asciiTheme="majorHAnsi" w:hAnsiTheme="majorHAnsi" w:cstheme="majorHAnsi"/>
+        </w:rPr>
+        <w:t xml:space="preserve"> Kết nối StudentTrackingServlet với dữ liệu chuyến đi thực tế. Khi phụ huynh truy cập, servlet sẽ gọi StudentDAO truy vấn thông tin tài xế phụ trách, biển số xe và trạng thái di chuyển hiện tại để hiển thị lên thanh thông tin "Chi tiết chuyến đi" bên cạnh bản đồ.</w:t>
+      </w:r>
+    </w:p>
+    <w:p>
+      <w:pPr>
+        <w:rPr>
+          <w:rFonts w:asciiTheme="majorHAnsi" w:hAnsiTheme="majorHAnsi" w:cstheme="majorHAnsi"/>
+        </w:rPr>
+      </w:pPr>
+      <w:r>
+        <w:rPr>
+          <w:rFonts w:asciiTheme="majorHAnsi" w:hAnsiTheme="majorHAnsi" w:cstheme="majorHAnsi"/>
+          <w:b/>
+          <w:bCs/>
+        </w:rPr>
+        <w:t>3. Xây dựng Bộ lọc bảo mật (Security Filter)</w:t>
+      </w:r>
+    </w:p>
+    <w:p>
+      <w:pPr>
+        <w:numPr>
+          <w:ilvl w:val="0"/>
+          <w:numId w:val="64"/>
+        </w:numPr>
+        <w:rPr>
+          <w:rFonts w:asciiTheme="majorHAnsi" w:hAnsiTheme="majorHAnsi" w:cstheme="majorHAnsi"/>
+        </w:rPr>
+      </w:pPr>
+      <w:r>
+        <w:rPr>
+          <w:rFonts w:asciiTheme="majorHAnsi" w:hAnsiTheme="majorHAnsi" w:cstheme="majorHAnsi"/>
+        </w:rPr>
+        <w:t>Để ngăn chặn việc người dùng chưa đăng nhập hoặc các vai trò khác (như Driver) truy cập trái phép vào các trang quản lý của phụ huynh bằng cách thay đổi URL (ví dụ cố tình gõ trực tiếp đường dẫn /parent/dashboard).</w:t>
+      </w:r>
+    </w:p>
+    <w:p>
+      <w:pPr>
+        <w:numPr>
+          <w:ilvl w:val="0"/>
+          <w:numId w:val="64"/>
+        </w:numPr>
+        <w:rPr>
+          <w:rFonts w:asciiTheme="majorHAnsi" w:hAnsiTheme="majorHAnsi" w:cstheme="majorHAnsi"/>
+        </w:rPr>
+      </w:pPr>
+      <w:r>
+        <w:rPr>
+          <w:rFonts w:asciiTheme="majorHAnsi" w:hAnsiTheme="majorHAnsi" w:cstheme="majorHAnsi"/>
+        </w:rPr>
+        <w:t>Nhóm đã triển khai một lớp Filter bảo mật ParentAuthenticationFilter.</w:t>
+      </w:r>
+    </w:p>
+    <w:p>
+      <w:pPr>
+        <w:numPr>
+          <w:ilvl w:val="0"/>
+          <w:numId w:val="64"/>
+        </w:numPr>
+        <w:rPr>
+          <w:rFonts w:asciiTheme="majorHAnsi" w:hAnsiTheme="majorHAnsi" w:cstheme="majorHAnsi"/>
+        </w:rPr>
+      </w:pPr>
+      <w:r>
+        <w:rPr>
+          <w:rFonts w:asciiTheme="majorHAnsi" w:hAnsiTheme="majorHAnsi" w:cstheme="majorHAnsi"/>
+          <w:b/>
+          <w:bCs/>
+        </w:rPr>
+        <w:t>Cơ chế hoạt động:</w:t>
+      </w:r>
+      <w:r>
+        <w:rPr>
+          <w:rFonts w:asciiTheme="majorHAnsi" w:hAnsiTheme="majorHAnsi" w:cstheme="majorHAnsi"/>
+        </w:rPr>
+        <w:t xml:space="preserve"> Filter này sẽ chặn toàn bộ các request có đường dẫn cấu trúc /parent/*. Hệ thống sẽ kiểm tra đối tượng User trong Session. Nếu Session trống hoặc thuộc tính role của tài khoản không phải là Parent, hệ thống sẽ tự động thực hiện lệnh response.sendRedirect đưa người dùng quay trở lại trang đăng nhập. </w:t>
+      </w:r>
+    </w:p>
+    <w:p>
+      <w:pPr>
+        <w:rPr>
+          <w:rFonts w:asciiTheme="majorHAnsi" w:hAnsiTheme="majorHAnsi" w:cstheme="majorHAnsi"/>
+        </w:rPr>
+      </w:pPr>
+      <w:r>
+        <w:rPr>
+          <w:rFonts w:asciiTheme="majorHAnsi" w:hAnsiTheme="majorHAnsi" w:cstheme="majorHAnsi"/>
+          <w:b/>
+          <w:bCs/>
+        </w:rPr>
+        <w:t>4. Kiểm thử tích hợp toàn diện (System Integration Testing)</w:t>
+      </w:r>
+    </w:p>
+    <w:p>
+      <w:pPr>
+        <w:numPr>
+          <w:ilvl w:val="0"/>
+          <w:numId w:val="65"/>
+        </w:numPr>
+        <w:rPr>
+          <w:rFonts w:asciiTheme="majorHAnsi" w:hAnsiTheme="majorHAnsi" w:cstheme="majorHAnsi"/>
+        </w:rPr>
+      </w:pPr>
+      <w:r>
+        <w:rPr>
+          <w:rFonts w:asciiTheme="majorHAnsi" w:hAnsiTheme="majorHAnsi" w:cstheme="majorHAnsi"/>
+        </w:rPr>
+        <w:t>Sau khi hoàn thành tất cả các file mã nguồn và giao diện cho Module Parent, nhóm tiến hành kiểm thử tích hợp chéo luồng dữ liệu (End-to-End Testing):</w:t>
+      </w:r>
+    </w:p>
+    <w:p>
+      <w:pPr>
+        <w:numPr>
+          <w:ilvl w:val="1"/>
+          <w:numId w:val="65"/>
+        </w:numPr>
+        <w:rPr>
+          <w:rFonts w:asciiTheme="majorHAnsi" w:hAnsiTheme="majorHAnsi" w:cstheme="majorHAnsi"/>
+        </w:rPr>
+      </w:pPr>
+      <w:r>
+        <w:rPr>
+          <w:rFonts w:asciiTheme="majorHAnsi" w:hAnsiTheme="majorHAnsi" w:cstheme="majorHAnsi"/>
+          <w:i/>
+          <w:iCs/>
+        </w:rPr>
+        <w:t>Luồng Thông báo:</w:t>
+      </w:r>
+      <w:r>
+        <w:rPr>
+          <w:rFonts w:asciiTheme="majorHAnsi" w:hAnsiTheme="majorHAnsi" w:cstheme="majorHAnsi"/>
+        </w:rPr>
+        <w:t xml:space="preserve"> Thử nghiệm dùng tài khoản Admin tạo thông báo mới -&gt; Đăng nhập tài khoản Parent kiểm tra xem thông báo có hiển thị theo thời gian thực hay không. </w:t>
+      </w:r>
+    </w:p>
+    <w:p>
+      <w:pPr>
+        <w:numPr>
+          <w:ilvl w:val="1"/>
+          <w:numId w:val="65"/>
+        </w:numPr>
+        <w:rPr>
+          <w:rFonts w:asciiTheme="majorHAnsi" w:hAnsiTheme="majorHAnsi" w:cstheme="majorHAnsi"/>
+        </w:rPr>
+      </w:pPr>
+      <w:r>
+        <w:rPr>
+          <w:rFonts w:asciiTheme="majorHAnsi" w:hAnsiTheme="majorHAnsi" w:cstheme="majorHAnsi"/>
+          <w:i/>
+          <w:iCs/>
+        </w:rPr>
+        <w:t>Luồng Xin nghỉ học:</w:t>
+      </w:r>
+      <w:r>
+        <w:rPr>
+          <w:rFonts w:asciiTheme="majorHAnsi" w:hAnsiTheme="majorHAnsi" w:cstheme="majorHAnsi"/>
+        </w:rPr>
+        <w:t xml:space="preserve"> Parent tạo đơn xin nghỉ -&gt; Kiểm tra dữ liệu trong bảng leave_requests -&gt; Kiểm tra xem tài khoản hệ thống phía nhà trường có nhận được đơn hay không.</w:t>
+      </w:r>
+    </w:p>
+    <w:p>
+      <w:pPr>
+        <w:numPr>
+          <w:ilvl w:val="0"/>
+          <w:numId w:val="65"/>
+        </w:numPr>
+        <w:rPr>
+          <w:rFonts w:asciiTheme="majorHAnsi" w:hAnsiTheme="majorHAnsi" w:cstheme="majorHAnsi"/>
+        </w:rPr>
+      </w:pPr>
+      <w:r>
+        <w:rPr>
+          <w:rFonts w:asciiTheme="majorHAnsi" w:hAnsiTheme="majorHAnsi" w:cstheme="majorHAnsi"/>
+          <w:b/>
+          <w:bCs/>
+        </w:rPr>
+        <w:t>Kết quả kiểm thử:</w:t>
+      </w:r>
+      <w:r>
+        <w:rPr>
+          <w:rFonts w:asciiTheme="majorHAnsi" w:hAnsiTheme="majorHAnsi" w:cstheme="majorHAnsi"/>
+        </w:rPr>
+        <w:t xml:space="preserve"> Hệ thống chạy mượt mà trên môi trường máy chủ Apache Tomcat, không xảy ra xung đột điều hướng giữa các Servlet, dữ liệu được đồng bộ hóa chính xác tuyệt đối với cơ sở dữ liệu. </w:t>
+      </w:r>
+    </w:p>
+    <w:p>
+      <w:pPr>
+        <w:rPr>
+          <w:rFonts w:asciiTheme="majorHAnsi" w:hAnsiTheme="majorHAnsi" w:cstheme="majorHAnsi"/>
+        </w:rPr>
+      </w:pPr>
+      <w:r>
+        <w:rPr>
+          <w:rFonts w:asciiTheme="majorHAnsi" w:hAnsiTheme="majorHAnsi" w:cstheme="majorHAnsi"/>
+          <w:b/>
+          <w:bCs/>
+        </w:rPr>
+        <w:t>5. Tổng kết và Đóng gói Module</w:t>
+      </w:r>
+    </w:p>
+    <w:p>
+      <w:pPr>
+        <w:numPr>
+          <w:ilvl w:val="0"/>
+          <w:numId w:val="66"/>
+        </w:numPr>
+        <w:rPr>
+          <w:rFonts w:asciiTheme="majorHAnsi" w:hAnsiTheme="majorHAnsi" w:cstheme="majorHAnsi"/>
+        </w:rPr>
+      </w:pPr>
+      <w:r>
+        <w:rPr>
+          <w:rFonts w:asciiTheme="majorHAnsi" w:hAnsiTheme="majorHAnsi" w:cstheme="majorHAnsi"/>
+        </w:rPr>
+        <w:t>Nhóm tiến hành chuẩn hóa lại mã nguồn, dọn dẹp các đoạn code thừa (clean code), bổ sung chú thích (comments) đầy đủ trong các file DAO và Servlet để giảng viên dễ theo dõi.</w:t>
+      </w:r>
+    </w:p>
+    <w:p>
+      <w:pPr>
+        <w:numPr>
+          <w:ilvl w:val="0"/>
+          <w:numId w:val="66"/>
+        </w:numPr>
+        <w:rPr>
+          <w:rFonts w:asciiTheme="majorHAnsi" w:hAnsiTheme="majorHAnsi" w:cstheme="majorHAnsi"/>
+        </w:rPr>
+      </w:pPr>
+      <w:r>
+        <w:rPr>
+          <w:rFonts w:asciiTheme="majorHAnsi" w:hAnsiTheme="majorHAnsi" w:cstheme="majorHAnsi"/>
+        </w:rPr>
+        <w:t>Đóng gói toàn bộ mã nguồn thành file triển khai, cấu hình file web.xml hoàn chỉnh.</w:t>
+      </w:r>
+    </w:p>
+    <w:p>
+      <w:pPr>
+        <w:numPr>
+          <w:ilvl w:val="0"/>
+          <w:numId w:val="66"/>
         </w:numPr>
         <w:rPr>
           <w:rFonts w:asciiTheme="majorHAnsi" w:hAnsiTheme="majorHAnsi" w:cstheme="majorHAnsi"/>
@@ -7766,6 +8387,155 @@
     </w:lvl>
   </w:abstractNum>
   <w:abstractNum w:abstractNumId="21" w15:restartNumberingAfterBreak="0">
+    <w:nsid w:val="2A7E621A"/>
+    <w:multiLevelType w:val="multilevel"/>
+    <w:tmpl w:val="966086DC"/>
+    <w:lvl w:ilvl="0">
+      <w:start w:val="1"/>
+      <w:numFmt w:val="bullet"/>
+      <w:lvlText w:val=""/>
+      <w:lvlJc w:val="left"/>
+      <w:pPr>
+        <w:tabs>
+          <w:tab w:val="num" w:pos="720"/>
+        </w:tabs>
+        <w:ind w:left="720" w:hanging="360"/>
+      </w:pPr>
+      <w:rPr>
+        <w:rFonts w:ascii="Symbol" w:hAnsi="Symbol" w:hint="default"/>
+        <w:sz w:val="20"/>
+      </w:rPr>
+    </w:lvl>
+    <w:lvl w:ilvl="1" w:tentative="1">
+      <w:start w:val="1"/>
+      <w:numFmt w:val="bullet"/>
+      <w:lvlText w:val="o"/>
+      <w:lvlJc w:val="left"/>
+      <w:pPr>
+        <w:tabs>
+          <w:tab w:val="num" w:pos="1440"/>
+        </w:tabs>
+        <w:ind w:left="1440" w:hanging="360"/>
+      </w:pPr>
+      <w:rPr>
+        <w:rFonts w:ascii="Courier New" w:hAnsi="Courier New" w:hint="default"/>
+        <w:sz w:val="20"/>
+      </w:rPr>
+    </w:lvl>
+    <w:lvl w:ilvl="2" w:tentative="1">
+      <w:start w:val="1"/>
+      <w:numFmt w:val="bullet"/>
+      <w:lvlText w:val=""/>
+      <w:lvlJc w:val="left"/>
+      <w:pPr>
+        <w:tabs>
+          <w:tab w:val="num" w:pos="2160"/>
+        </w:tabs>
+        <w:ind w:left="2160" w:hanging="360"/>
+      </w:pPr>
+      <w:rPr>
+        <w:rFonts w:ascii="Wingdings" w:hAnsi="Wingdings" w:hint="default"/>
+        <w:sz w:val="20"/>
+      </w:rPr>
+    </w:lvl>
+    <w:lvl w:ilvl="3" w:tentative="1">
+      <w:start w:val="1"/>
+      <w:numFmt w:val="bullet"/>
+      <w:lvlText w:val=""/>
+      <w:lvlJc w:val="left"/>
+      <w:pPr>
+        <w:tabs>
+          <w:tab w:val="num" w:pos="2880"/>
+        </w:tabs>
+        <w:ind w:left="2880" w:hanging="360"/>
+      </w:pPr>
+      <w:rPr>
+        <w:rFonts w:ascii="Wingdings" w:hAnsi="Wingdings" w:hint="default"/>
+        <w:sz w:val="20"/>
+      </w:rPr>
+    </w:lvl>
+    <w:lvl w:ilvl="4" w:tentative="1">
+      <w:start w:val="1"/>
+      <w:numFmt w:val="bullet"/>
+      <w:lvlText w:val=""/>
+      <w:lvlJc w:val="left"/>
+      <w:pPr>
+        <w:tabs>
+          <w:tab w:val="num" w:pos="3600"/>
+        </w:tabs>
+        <w:ind w:left="3600" w:hanging="360"/>
+      </w:pPr>
+      <w:rPr>
+        <w:rFonts w:ascii="Wingdings" w:hAnsi="Wingdings" w:hint="default"/>
+        <w:sz w:val="20"/>
+      </w:rPr>
+    </w:lvl>
+    <w:lvl w:ilvl="5" w:tentative="1">
+      <w:start w:val="1"/>
+      <w:numFmt w:val="bullet"/>
+      <w:lvlText w:val=""/>
+      <w:lvlJc w:val="left"/>
+      <w:pPr>
+        <w:tabs>
+          <w:tab w:val="num" w:pos="4320"/>
+        </w:tabs>
+        <w:ind w:left="4320" w:hanging="360"/>
+      </w:pPr>
+      <w:rPr>
+        <w:rFonts w:ascii="Wingdings" w:hAnsi="Wingdings" w:hint="default"/>
+        <w:sz w:val="20"/>
+      </w:rPr>
+    </w:lvl>
+    <w:lvl w:ilvl="6" w:tentative="1">
+      <w:start w:val="1"/>
+      <w:numFmt w:val="bullet"/>
+      <w:lvlText w:val=""/>
+      <w:lvlJc w:val="left"/>
+      <w:pPr>
+        <w:tabs>
+          <w:tab w:val="num" w:pos="5040"/>
+        </w:tabs>
+        <w:ind w:left="5040" w:hanging="360"/>
+      </w:pPr>
+      <w:rPr>
+        <w:rFonts w:ascii="Wingdings" w:hAnsi="Wingdings" w:hint="default"/>
+        <w:sz w:val="20"/>
+      </w:rPr>
+    </w:lvl>
+    <w:lvl w:ilvl="7" w:tentative="1">
+      <w:start w:val="1"/>
+      <w:numFmt w:val="bullet"/>
+      <w:lvlText w:val=""/>
+      <w:lvlJc w:val="left"/>
+      <w:pPr>
+        <w:tabs>
+          <w:tab w:val="num" w:pos="5760"/>
+        </w:tabs>
+        <w:ind w:left="5760" w:hanging="360"/>
+      </w:pPr>
+      <w:rPr>
+        <w:rFonts w:ascii="Wingdings" w:hAnsi="Wingdings" w:hint="default"/>
+        <w:sz w:val="20"/>
+      </w:rPr>
+    </w:lvl>
+    <w:lvl w:ilvl="8" w:tentative="1">
+      <w:start w:val="1"/>
+      <w:numFmt w:val="bullet"/>
+      <w:lvlText w:val=""/>
+      <w:lvlJc w:val="left"/>
+      <w:pPr>
+        <w:tabs>
+          <w:tab w:val="num" w:pos="6480"/>
+        </w:tabs>
+        <w:ind w:left="6480" w:hanging="360"/>
+      </w:pPr>
+      <w:rPr>
+        <w:rFonts w:ascii="Wingdings" w:hAnsi="Wingdings" w:hint="default"/>
+        <w:sz w:val="20"/>
+      </w:rPr>
+    </w:lvl>
+  </w:abstractNum>
+  <w:abstractNum w:abstractNumId="22" w15:restartNumberingAfterBreak="0">
     <w:nsid w:val="2B371F70"/>
     <w:multiLevelType w:val="multilevel"/>
     <w:tmpl w:val="9FBC88DE"/>
@@ -7914,7 +8684,7 @@
       </w:rPr>
     </w:lvl>
   </w:abstractNum>
-  <w:abstractNum w:abstractNumId="22" w15:restartNumberingAfterBreak="0">
+  <w:abstractNum w:abstractNumId="23" w15:restartNumberingAfterBreak="0">
     <w:nsid w:val="2D8E5FD8"/>
     <w:multiLevelType w:val="multilevel"/>
     <w:tmpl w:val="6DB8ADB2"/>
@@ -8063,7 +8833,7 @@
       </w:rPr>
     </w:lvl>
   </w:abstractNum>
-  <w:abstractNum w:abstractNumId="23" w15:restartNumberingAfterBreak="0">
+  <w:abstractNum w:abstractNumId="24" w15:restartNumberingAfterBreak="0">
     <w:nsid w:val="2E326A99"/>
     <w:multiLevelType w:val="multilevel"/>
     <w:tmpl w:val="80ACE3B8"/>
@@ -8212,7 +8982,7 @@
       </w:rPr>
     </w:lvl>
   </w:abstractNum>
-  <w:abstractNum w:abstractNumId="24" w15:restartNumberingAfterBreak="0">
+  <w:abstractNum w:abstractNumId="25" w15:restartNumberingAfterBreak="0">
     <w:nsid w:val="2FA92943"/>
     <w:multiLevelType w:val="multilevel"/>
     <w:tmpl w:val="39D63CD2"/>
@@ -8326,7 +9096,7 @@
       </w:pPr>
     </w:lvl>
   </w:abstractNum>
-  <w:abstractNum w:abstractNumId="25" w15:restartNumberingAfterBreak="0">
+  <w:abstractNum w:abstractNumId="26" w15:restartNumberingAfterBreak="0">
     <w:nsid w:val="2FDA73D9"/>
     <w:multiLevelType w:val="multilevel"/>
     <w:tmpl w:val="47C6F710"/>
@@ -8475,7 +9245,7 @@
       </w:rPr>
     </w:lvl>
   </w:abstractNum>
-  <w:abstractNum w:abstractNumId="26" w15:restartNumberingAfterBreak="0">
+  <w:abstractNum w:abstractNumId="27" w15:restartNumberingAfterBreak="0">
     <w:nsid w:val="31CE6143"/>
     <w:multiLevelType w:val="multilevel"/>
     <w:tmpl w:val="10087284"/>
@@ -8624,7 +9394,7 @@
       </w:rPr>
     </w:lvl>
   </w:abstractNum>
-  <w:abstractNum w:abstractNumId="27" w15:restartNumberingAfterBreak="0">
+  <w:abstractNum w:abstractNumId="28" w15:restartNumberingAfterBreak="0">
     <w:nsid w:val="32121440"/>
     <w:multiLevelType w:val="multilevel"/>
     <w:tmpl w:val="2C926CFC"/>
@@ -8773,7 +9543,7 @@
       </w:rPr>
     </w:lvl>
   </w:abstractNum>
-  <w:abstractNum w:abstractNumId="28" w15:restartNumberingAfterBreak="0">
+  <w:abstractNum w:abstractNumId="29" w15:restartNumberingAfterBreak="0">
     <w:nsid w:val="36076FFE"/>
     <w:multiLevelType w:val="multilevel"/>
     <w:tmpl w:val="82C413C8"/>
@@ -8922,7 +9692,7 @@
       </w:rPr>
     </w:lvl>
   </w:abstractNum>
-  <w:abstractNum w:abstractNumId="29" w15:restartNumberingAfterBreak="0">
+  <w:abstractNum w:abstractNumId="30" w15:restartNumberingAfterBreak="0">
     <w:nsid w:val="372D065B"/>
     <w:multiLevelType w:val="multilevel"/>
     <w:tmpl w:val="17D49D4A"/>
@@ -9071,7 +9841,7 @@
       </w:rPr>
     </w:lvl>
   </w:abstractNum>
-  <w:abstractNum w:abstractNumId="30" w15:restartNumberingAfterBreak="0">
+  <w:abstractNum w:abstractNumId="31" w15:restartNumberingAfterBreak="0">
     <w:nsid w:val="39745552"/>
     <w:multiLevelType w:val="multilevel"/>
     <w:tmpl w:val="DA16FEBE"/>
@@ -9220,7 +9990,156 @@
       </w:rPr>
     </w:lvl>
   </w:abstractNum>
-  <w:abstractNum w:abstractNumId="31" w15:restartNumberingAfterBreak="0">
+  <w:abstractNum w:abstractNumId="32" w15:restartNumberingAfterBreak="0">
+    <w:nsid w:val="3B8102C0"/>
+    <w:multiLevelType w:val="multilevel"/>
+    <w:tmpl w:val="64A0A2D4"/>
+    <w:lvl w:ilvl="0">
+      <w:start w:val="1"/>
+      <w:numFmt w:val="bullet"/>
+      <w:lvlText w:val=""/>
+      <w:lvlJc w:val="left"/>
+      <w:pPr>
+        <w:tabs>
+          <w:tab w:val="num" w:pos="720"/>
+        </w:tabs>
+        <w:ind w:left="720" w:hanging="360"/>
+      </w:pPr>
+      <w:rPr>
+        <w:rFonts w:ascii="Symbol" w:hAnsi="Symbol" w:hint="default"/>
+        <w:sz w:val="20"/>
+      </w:rPr>
+    </w:lvl>
+    <w:lvl w:ilvl="1" w:tentative="1">
+      <w:start w:val="1"/>
+      <w:numFmt w:val="bullet"/>
+      <w:lvlText w:val="o"/>
+      <w:lvlJc w:val="left"/>
+      <w:pPr>
+        <w:tabs>
+          <w:tab w:val="num" w:pos="1440"/>
+        </w:tabs>
+        <w:ind w:left="1440" w:hanging="360"/>
+      </w:pPr>
+      <w:rPr>
+        <w:rFonts w:ascii="Courier New" w:hAnsi="Courier New" w:hint="default"/>
+        <w:sz w:val="20"/>
+      </w:rPr>
+    </w:lvl>
+    <w:lvl w:ilvl="2" w:tentative="1">
+      <w:start w:val="1"/>
+      <w:numFmt w:val="bullet"/>
+      <w:lvlText w:val=""/>
+      <w:lvlJc w:val="left"/>
+      <w:pPr>
+        <w:tabs>
+          <w:tab w:val="num" w:pos="2160"/>
+        </w:tabs>
+        <w:ind w:left="2160" w:hanging="360"/>
+      </w:pPr>
+      <w:rPr>
+        <w:rFonts w:ascii="Wingdings" w:hAnsi="Wingdings" w:hint="default"/>
+        <w:sz w:val="20"/>
+      </w:rPr>
+    </w:lvl>
+    <w:lvl w:ilvl="3" w:tentative="1">
+      <w:start w:val="1"/>
+      <w:numFmt w:val="bullet"/>
+      <w:lvlText w:val=""/>
+      <w:lvlJc w:val="left"/>
+      <w:pPr>
+        <w:tabs>
+          <w:tab w:val="num" w:pos="2880"/>
+        </w:tabs>
+        <w:ind w:left="2880" w:hanging="360"/>
+      </w:pPr>
+      <w:rPr>
+        <w:rFonts w:ascii="Wingdings" w:hAnsi="Wingdings" w:hint="default"/>
+        <w:sz w:val="20"/>
+      </w:rPr>
+    </w:lvl>
+    <w:lvl w:ilvl="4" w:tentative="1">
+      <w:start w:val="1"/>
+      <w:numFmt w:val="bullet"/>
+      <w:lvlText w:val=""/>
+      <w:lvlJc w:val="left"/>
+      <w:pPr>
+        <w:tabs>
+          <w:tab w:val="num" w:pos="3600"/>
+        </w:tabs>
+        <w:ind w:left="3600" w:hanging="360"/>
+      </w:pPr>
+      <w:rPr>
+        <w:rFonts w:ascii="Wingdings" w:hAnsi="Wingdings" w:hint="default"/>
+        <w:sz w:val="20"/>
+      </w:rPr>
+    </w:lvl>
+    <w:lvl w:ilvl="5" w:tentative="1">
+      <w:start w:val="1"/>
+      <w:numFmt w:val="bullet"/>
+      <w:lvlText w:val=""/>
+      <w:lvlJc w:val="left"/>
+      <w:pPr>
+        <w:tabs>
+          <w:tab w:val="num" w:pos="4320"/>
+        </w:tabs>
+        <w:ind w:left="4320" w:hanging="360"/>
+      </w:pPr>
+      <w:rPr>
+        <w:rFonts w:ascii="Wingdings" w:hAnsi="Wingdings" w:hint="default"/>
+        <w:sz w:val="20"/>
+      </w:rPr>
+    </w:lvl>
+    <w:lvl w:ilvl="6" w:tentative="1">
+      <w:start w:val="1"/>
+      <w:numFmt w:val="bullet"/>
+      <w:lvlText w:val=""/>
+      <w:lvlJc w:val="left"/>
+      <w:pPr>
+        <w:tabs>
+          <w:tab w:val="num" w:pos="5040"/>
+        </w:tabs>
+        <w:ind w:left="5040" w:hanging="360"/>
+      </w:pPr>
+      <w:rPr>
+        <w:rFonts w:ascii="Wingdings" w:hAnsi="Wingdings" w:hint="default"/>
+        <w:sz w:val="20"/>
+      </w:rPr>
+    </w:lvl>
+    <w:lvl w:ilvl="7" w:tentative="1">
+      <w:start w:val="1"/>
+      <w:numFmt w:val="bullet"/>
+      <w:lvlText w:val=""/>
+      <w:lvlJc w:val="left"/>
+      <w:pPr>
+        <w:tabs>
+          <w:tab w:val="num" w:pos="5760"/>
+        </w:tabs>
+        <w:ind w:left="5760" w:hanging="360"/>
+      </w:pPr>
+      <w:rPr>
+        <w:rFonts w:ascii="Wingdings" w:hAnsi="Wingdings" w:hint="default"/>
+        <w:sz w:val="20"/>
+      </w:rPr>
+    </w:lvl>
+    <w:lvl w:ilvl="8" w:tentative="1">
+      <w:start w:val="1"/>
+      <w:numFmt w:val="bullet"/>
+      <w:lvlText w:val=""/>
+      <w:lvlJc w:val="left"/>
+      <w:pPr>
+        <w:tabs>
+          <w:tab w:val="num" w:pos="6480"/>
+        </w:tabs>
+        <w:ind w:left="6480" w:hanging="360"/>
+      </w:pPr>
+      <w:rPr>
+        <w:rFonts w:ascii="Wingdings" w:hAnsi="Wingdings" w:hint="default"/>
+        <w:sz w:val="20"/>
+      </w:rPr>
+    </w:lvl>
+  </w:abstractNum>
+  <w:abstractNum w:abstractNumId="33" w15:restartNumberingAfterBreak="0">
     <w:nsid w:val="403E3F26"/>
     <w:multiLevelType w:val="multilevel"/>
     <w:tmpl w:val="BB32005C"/>
@@ -9369,7 +10288,156 @@
       </w:rPr>
     </w:lvl>
   </w:abstractNum>
-  <w:abstractNum w:abstractNumId="32" w15:restartNumberingAfterBreak="0">
+  <w:abstractNum w:abstractNumId="34" w15:restartNumberingAfterBreak="0">
+    <w:nsid w:val="43F42D13"/>
+    <w:multiLevelType w:val="multilevel"/>
+    <w:tmpl w:val="FFC83354"/>
+    <w:lvl w:ilvl="0">
+      <w:start w:val="1"/>
+      <w:numFmt w:val="bullet"/>
+      <w:lvlText w:val=""/>
+      <w:lvlJc w:val="left"/>
+      <w:pPr>
+        <w:tabs>
+          <w:tab w:val="num" w:pos="720"/>
+        </w:tabs>
+        <w:ind w:left="720" w:hanging="360"/>
+      </w:pPr>
+      <w:rPr>
+        <w:rFonts w:ascii="Symbol" w:hAnsi="Symbol" w:hint="default"/>
+        <w:sz w:val="20"/>
+      </w:rPr>
+    </w:lvl>
+    <w:lvl w:ilvl="1" w:tentative="1">
+      <w:start w:val="1"/>
+      <w:numFmt w:val="bullet"/>
+      <w:lvlText w:val="o"/>
+      <w:lvlJc w:val="left"/>
+      <w:pPr>
+        <w:tabs>
+          <w:tab w:val="num" w:pos="1440"/>
+        </w:tabs>
+        <w:ind w:left="1440" w:hanging="360"/>
+      </w:pPr>
+      <w:rPr>
+        <w:rFonts w:ascii="Courier New" w:hAnsi="Courier New" w:hint="default"/>
+        <w:sz w:val="20"/>
+      </w:rPr>
+    </w:lvl>
+    <w:lvl w:ilvl="2" w:tentative="1">
+      <w:start w:val="1"/>
+      <w:numFmt w:val="bullet"/>
+      <w:lvlText w:val=""/>
+      <w:lvlJc w:val="left"/>
+      <w:pPr>
+        <w:tabs>
+          <w:tab w:val="num" w:pos="2160"/>
+        </w:tabs>
+        <w:ind w:left="2160" w:hanging="360"/>
+      </w:pPr>
+      <w:rPr>
+        <w:rFonts w:ascii="Wingdings" w:hAnsi="Wingdings" w:hint="default"/>
+        <w:sz w:val="20"/>
+      </w:rPr>
+    </w:lvl>
+    <w:lvl w:ilvl="3" w:tentative="1">
+      <w:start w:val="1"/>
+      <w:numFmt w:val="bullet"/>
+      <w:lvlText w:val=""/>
+      <w:lvlJc w:val="left"/>
+      <w:pPr>
+        <w:tabs>
+          <w:tab w:val="num" w:pos="2880"/>
+        </w:tabs>
+        <w:ind w:left="2880" w:hanging="360"/>
+      </w:pPr>
+      <w:rPr>
+        <w:rFonts w:ascii="Wingdings" w:hAnsi="Wingdings" w:hint="default"/>
+        <w:sz w:val="20"/>
+      </w:rPr>
+    </w:lvl>
+    <w:lvl w:ilvl="4" w:tentative="1">
+      <w:start w:val="1"/>
+      <w:numFmt w:val="bullet"/>
+      <w:lvlText w:val=""/>
+      <w:lvlJc w:val="left"/>
+      <w:pPr>
+        <w:tabs>
+          <w:tab w:val="num" w:pos="3600"/>
+        </w:tabs>
+        <w:ind w:left="3600" w:hanging="360"/>
+      </w:pPr>
+      <w:rPr>
+        <w:rFonts w:ascii="Wingdings" w:hAnsi="Wingdings" w:hint="default"/>
+        <w:sz w:val="20"/>
+      </w:rPr>
+    </w:lvl>
+    <w:lvl w:ilvl="5" w:tentative="1">
+      <w:start w:val="1"/>
+      <w:numFmt w:val="bullet"/>
+      <w:lvlText w:val=""/>
+      <w:lvlJc w:val="left"/>
+      <w:pPr>
+        <w:tabs>
+          <w:tab w:val="num" w:pos="4320"/>
+        </w:tabs>
+        <w:ind w:left="4320" w:hanging="360"/>
+      </w:pPr>
+      <w:rPr>
+        <w:rFonts w:ascii="Wingdings" w:hAnsi="Wingdings" w:hint="default"/>
+        <w:sz w:val="20"/>
+      </w:rPr>
+    </w:lvl>
+    <w:lvl w:ilvl="6" w:tentative="1">
+      <w:start w:val="1"/>
+      <w:numFmt w:val="bullet"/>
+      <w:lvlText w:val=""/>
+      <w:lvlJc w:val="left"/>
+      <w:pPr>
+        <w:tabs>
+          <w:tab w:val="num" w:pos="5040"/>
+        </w:tabs>
+        <w:ind w:left="5040" w:hanging="360"/>
+      </w:pPr>
+      <w:rPr>
+        <w:rFonts w:ascii="Wingdings" w:hAnsi="Wingdings" w:hint="default"/>
+        <w:sz w:val="20"/>
+      </w:rPr>
+    </w:lvl>
+    <w:lvl w:ilvl="7" w:tentative="1">
+      <w:start w:val="1"/>
+      <w:numFmt w:val="bullet"/>
+      <w:lvlText w:val=""/>
+      <w:lvlJc w:val="left"/>
+      <w:pPr>
+        <w:tabs>
+          <w:tab w:val="num" w:pos="5760"/>
+        </w:tabs>
+        <w:ind w:left="5760" w:hanging="360"/>
+      </w:pPr>
+      <w:rPr>
+        <w:rFonts w:ascii="Wingdings" w:hAnsi="Wingdings" w:hint="default"/>
+        <w:sz w:val="20"/>
+      </w:rPr>
+    </w:lvl>
+    <w:lvl w:ilvl="8" w:tentative="1">
+      <w:start w:val="1"/>
+      <w:numFmt w:val="bullet"/>
+      <w:lvlText w:val=""/>
+      <w:lvlJc w:val="left"/>
+      <w:pPr>
+        <w:tabs>
+          <w:tab w:val="num" w:pos="6480"/>
+        </w:tabs>
+        <w:ind w:left="6480" w:hanging="360"/>
+      </w:pPr>
+      <w:rPr>
+        <w:rFonts w:ascii="Wingdings" w:hAnsi="Wingdings" w:hint="default"/>
+        <w:sz w:val="20"/>
+      </w:rPr>
+    </w:lvl>
+  </w:abstractNum>
+  <w:abstractNum w:abstractNumId="35" w15:restartNumberingAfterBreak="0">
     <w:nsid w:val="456164C1"/>
     <w:multiLevelType w:val="multilevel"/>
     <w:tmpl w:val="05BA20CC"/>
@@ -9518,7 +10586,7 @@
       </w:rPr>
     </w:lvl>
   </w:abstractNum>
-  <w:abstractNum w:abstractNumId="33" w15:restartNumberingAfterBreak="0">
+  <w:abstractNum w:abstractNumId="36" w15:restartNumberingAfterBreak="0">
     <w:nsid w:val="46C41514"/>
     <w:multiLevelType w:val="multilevel"/>
     <w:tmpl w:val="9334CBA0"/>
@@ -9667,7 +10735,7 @@
       </w:rPr>
     </w:lvl>
   </w:abstractNum>
-  <w:abstractNum w:abstractNumId="34" w15:restartNumberingAfterBreak="0">
+  <w:abstractNum w:abstractNumId="37" w15:restartNumberingAfterBreak="0">
     <w:nsid w:val="46C957AE"/>
     <w:multiLevelType w:val="multilevel"/>
     <w:tmpl w:val="D3D0528E"/>
@@ -9816,7 +10884,7 @@
       </w:rPr>
     </w:lvl>
   </w:abstractNum>
-  <w:abstractNum w:abstractNumId="35" w15:restartNumberingAfterBreak="0">
+  <w:abstractNum w:abstractNumId="38" w15:restartNumberingAfterBreak="0">
     <w:nsid w:val="475C512B"/>
     <w:multiLevelType w:val="multilevel"/>
     <w:tmpl w:val="37566C62"/>
@@ -9965,7 +11033,7 @@
       </w:rPr>
     </w:lvl>
   </w:abstractNum>
-  <w:abstractNum w:abstractNumId="36" w15:restartNumberingAfterBreak="0">
+  <w:abstractNum w:abstractNumId="39" w15:restartNumberingAfterBreak="0">
     <w:nsid w:val="47750D39"/>
     <w:multiLevelType w:val="multilevel"/>
     <w:tmpl w:val="C6902184"/>
@@ -10114,7 +11182,7 @@
       </w:rPr>
     </w:lvl>
   </w:abstractNum>
-  <w:abstractNum w:abstractNumId="37" w15:restartNumberingAfterBreak="0">
+  <w:abstractNum w:abstractNumId="40" w15:restartNumberingAfterBreak="0">
     <w:nsid w:val="49271B50"/>
     <w:multiLevelType w:val="multilevel"/>
     <w:tmpl w:val="E4400332"/>
@@ -10263,7 +11331,7 @@
       </w:rPr>
     </w:lvl>
   </w:abstractNum>
-  <w:abstractNum w:abstractNumId="38" w15:restartNumberingAfterBreak="0">
+  <w:abstractNum w:abstractNumId="41" w15:restartNumberingAfterBreak="0">
     <w:nsid w:val="4CEA6D81"/>
     <w:multiLevelType w:val="multilevel"/>
     <w:tmpl w:val="625E35A6"/>
@@ -10380,7 +11448,7 @@
       </w:pPr>
     </w:lvl>
   </w:abstractNum>
-  <w:abstractNum w:abstractNumId="39" w15:restartNumberingAfterBreak="0">
+  <w:abstractNum w:abstractNumId="42" w15:restartNumberingAfterBreak="0">
     <w:nsid w:val="4D894A05"/>
     <w:multiLevelType w:val="multilevel"/>
     <w:tmpl w:val="A7F4A978"/>
@@ -10529,7 +11597,7 @@
       </w:rPr>
     </w:lvl>
   </w:abstractNum>
-  <w:abstractNum w:abstractNumId="40" w15:restartNumberingAfterBreak="0">
+  <w:abstractNum w:abstractNumId="43" w15:restartNumberingAfterBreak="0">
     <w:nsid w:val="505B09E1"/>
     <w:multiLevelType w:val="multilevel"/>
     <w:tmpl w:val="5AB06700"/>
@@ -10678,7 +11746,7 @@
       </w:rPr>
     </w:lvl>
   </w:abstractNum>
-  <w:abstractNum w:abstractNumId="41" w15:restartNumberingAfterBreak="0">
+  <w:abstractNum w:abstractNumId="44" w15:restartNumberingAfterBreak="0">
     <w:nsid w:val="50B45456"/>
     <w:multiLevelType w:val="multilevel"/>
     <w:tmpl w:val="4524DABE"/>
@@ -10827,7 +11895,7 @@
       </w:rPr>
     </w:lvl>
   </w:abstractNum>
-  <w:abstractNum w:abstractNumId="42" w15:restartNumberingAfterBreak="0">
+  <w:abstractNum w:abstractNumId="45" w15:restartNumberingAfterBreak="0">
     <w:nsid w:val="548A7638"/>
     <w:multiLevelType w:val="multilevel"/>
     <w:tmpl w:val="419EA6C6"/>
@@ -10976,7 +12044,7 @@
       </w:rPr>
     </w:lvl>
   </w:abstractNum>
-  <w:abstractNum w:abstractNumId="43" w15:restartNumberingAfterBreak="0">
+  <w:abstractNum w:abstractNumId="46" w15:restartNumberingAfterBreak="0">
     <w:nsid w:val="555D1E76"/>
     <w:multiLevelType w:val="multilevel"/>
     <w:tmpl w:val="75BAEAC0"/>
@@ -11125,7 +12193,7 @@
       </w:rPr>
     </w:lvl>
   </w:abstractNum>
-  <w:abstractNum w:abstractNumId="44" w15:restartNumberingAfterBreak="0">
+  <w:abstractNum w:abstractNumId="47" w15:restartNumberingAfterBreak="0">
     <w:nsid w:val="56ED7E95"/>
     <w:multiLevelType w:val="multilevel"/>
     <w:tmpl w:val="C8505DFE"/>
@@ -11274,7 +12342,7 @@
       </w:rPr>
     </w:lvl>
   </w:abstractNum>
-  <w:abstractNum w:abstractNumId="45" w15:restartNumberingAfterBreak="0">
+  <w:abstractNum w:abstractNumId="48" w15:restartNumberingAfterBreak="0">
     <w:nsid w:val="56F54825"/>
     <w:multiLevelType w:val="multilevel"/>
     <w:tmpl w:val="DA28AD34"/>
@@ -11423,7 +12491,7 @@
       </w:rPr>
     </w:lvl>
   </w:abstractNum>
-  <w:abstractNum w:abstractNumId="46" w15:restartNumberingAfterBreak="0">
+  <w:abstractNum w:abstractNumId="49" w15:restartNumberingAfterBreak="0">
     <w:nsid w:val="5D5F5743"/>
     <w:multiLevelType w:val="multilevel"/>
     <w:tmpl w:val="C1902DD8"/>
@@ -11572,7 +12640,156 @@
       </w:rPr>
     </w:lvl>
   </w:abstractNum>
-  <w:abstractNum w:abstractNumId="47" w15:restartNumberingAfterBreak="0">
+  <w:abstractNum w:abstractNumId="50" w15:restartNumberingAfterBreak="0">
+    <w:nsid w:val="5DBF45C9"/>
+    <w:multiLevelType w:val="multilevel"/>
+    <w:tmpl w:val="02829CC6"/>
+    <w:lvl w:ilvl="0">
+      <w:start w:val="1"/>
+      <w:numFmt w:val="bullet"/>
+      <w:lvlText w:val=""/>
+      <w:lvlJc w:val="left"/>
+      <w:pPr>
+        <w:tabs>
+          <w:tab w:val="num" w:pos="720"/>
+        </w:tabs>
+        <w:ind w:left="720" w:hanging="360"/>
+      </w:pPr>
+      <w:rPr>
+        <w:rFonts w:ascii="Symbol" w:hAnsi="Symbol" w:hint="default"/>
+        <w:sz w:val="20"/>
+      </w:rPr>
+    </w:lvl>
+    <w:lvl w:ilvl="1">
+      <w:start w:val="1"/>
+      <w:numFmt w:val="bullet"/>
+      <w:lvlText w:val="o"/>
+      <w:lvlJc w:val="left"/>
+      <w:pPr>
+        <w:tabs>
+          <w:tab w:val="num" w:pos="1440"/>
+        </w:tabs>
+        <w:ind w:left="1440" w:hanging="360"/>
+      </w:pPr>
+      <w:rPr>
+        <w:rFonts w:ascii="Courier New" w:hAnsi="Courier New" w:hint="default"/>
+        <w:sz w:val="20"/>
+      </w:rPr>
+    </w:lvl>
+    <w:lvl w:ilvl="2" w:tentative="1">
+      <w:start w:val="1"/>
+      <w:numFmt w:val="bullet"/>
+      <w:lvlText w:val=""/>
+      <w:lvlJc w:val="left"/>
+      <w:pPr>
+        <w:tabs>
+          <w:tab w:val="num" w:pos="2160"/>
+        </w:tabs>
+        <w:ind w:left="2160" w:hanging="360"/>
+      </w:pPr>
+      <w:rPr>
+        <w:rFonts w:ascii="Wingdings" w:hAnsi="Wingdings" w:hint="default"/>
+        <w:sz w:val="20"/>
+      </w:rPr>
+    </w:lvl>
+    <w:lvl w:ilvl="3" w:tentative="1">
+      <w:start w:val="1"/>
+      <w:numFmt w:val="bullet"/>
+      <w:lvlText w:val=""/>
+      <w:lvlJc w:val="left"/>
+      <w:pPr>
+        <w:tabs>
+          <w:tab w:val="num" w:pos="2880"/>
+        </w:tabs>
+        <w:ind w:left="2880" w:hanging="360"/>
+      </w:pPr>
+      <w:rPr>
+        <w:rFonts w:ascii="Wingdings" w:hAnsi="Wingdings" w:hint="default"/>
+        <w:sz w:val="20"/>
+      </w:rPr>
+    </w:lvl>
+    <w:lvl w:ilvl="4" w:tentative="1">
+      <w:start w:val="1"/>
+      <w:numFmt w:val="bullet"/>
+      <w:lvlText w:val=""/>
+      <w:lvlJc w:val="left"/>
+      <w:pPr>
+        <w:tabs>
+          <w:tab w:val="num" w:pos="3600"/>
+        </w:tabs>
+        <w:ind w:left="3600" w:hanging="360"/>
+      </w:pPr>
+      <w:rPr>
+        <w:rFonts w:ascii="Wingdings" w:hAnsi="Wingdings" w:hint="default"/>
+        <w:sz w:val="20"/>
+      </w:rPr>
+    </w:lvl>
+    <w:lvl w:ilvl="5" w:tentative="1">
+      <w:start w:val="1"/>
+      <w:numFmt w:val="bullet"/>
+      <w:lvlText w:val=""/>
+      <w:lvlJc w:val="left"/>
+      <w:pPr>
+        <w:tabs>
+          <w:tab w:val="num" w:pos="4320"/>
+        </w:tabs>
+        <w:ind w:left="4320" w:hanging="360"/>
+      </w:pPr>
+      <w:rPr>
+        <w:rFonts w:ascii="Wingdings" w:hAnsi="Wingdings" w:hint="default"/>
+        <w:sz w:val="20"/>
+      </w:rPr>
+    </w:lvl>
+    <w:lvl w:ilvl="6" w:tentative="1">
+      <w:start w:val="1"/>
+      <w:numFmt w:val="bullet"/>
+      <w:lvlText w:val=""/>
+      <w:lvlJc w:val="left"/>
+      <w:pPr>
+        <w:tabs>
+          <w:tab w:val="num" w:pos="5040"/>
+        </w:tabs>
+        <w:ind w:left="5040" w:hanging="360"/>
+      </w:pPr>
+      <w:rPr>
+        <w:rFonts w:ascii="Wingdings" w:hAnsi="Wingdings" w:hint="default"/>
+        <w:sz w:val="20"/>
+      </w:rPr>
+    </w:lvl>
+    <w:lvl w:ilvl="7" w:tentative="1">
+      <w:start w:val="1"/>
+      <w:numFmt w:val="bullet"/>
+      <w:lvlText w:val=""/>
+      <w:lvlJc w:val="left"/>
+      <w:pPr>
+        <w:tabs>
+          <w:tab w:val="num" w:pos="5760"/>
+        </w:tabs>
+        <w:ind w:left="5760" w:hanging="360"/>
+      </w:pPr>
+      <w:rPr>
+        <w:rFonts w:ascii="Wingdings" w:hAnsi="Wingdings" w:hint="default"/>
+        <w:sz w:val="20"/>
+      </w:rPr>
+    </w:lvl>
+    <w:lvl w:ilvl="8" w:tentative="1">
+      <w:start w:val="1"/>
+      <w:numFmt w:val="bullet"/>
+      <w:lvlText w:val=""/>
+      <w:lvlJc w:val="left"/>
+      <w:pPr>
+        <w:tabs>
+          <w:tab w:val="num" w:pos="6480"/>
+        </w:tabs>
+        <w:ind w:left="6480" w:hanging="360"/>
+      </w:pPr>
+      <w:rPr>
+        <w:rFonts w:ascii="Wingdings" w:hAnsi="Wingdings" w:hint="default"/>
+        <w:sz w:val="20"/>
+      </w:rPr>
+    </w:lvl>
+  </w:abstractNum>
+  <w:abstractNum w:abstractNumId="51" w15:restartNumberingAfterBreak="0">
     <w:nsid w:val="5E2573C5"/>
     <w:multiLevelType w:val="multilevel"/>
     <w:tmpl w:val="5CFA7BFC"/>
@@ -11721,7 +12938,7 @@
       </w:rPr>
     </w:lvl>
   </w:abstractNum>
-  <w:abstractNum w:abstractNumId="48" w15:restartNumberingAfterBreak="0">
+  <w:abstractNum w:abstractNumId="52" w15:restartNumberingAfterBreak="0">
     <w:nsid w:val="62477B91"/>
     <w:multiLevelType w:val="multilevel"/>
     <w:tmpl w:val="70142CDA"/>
@@ -11870,7 +13087,156 @@
       </w:rPr>
     </w:lvl>
   </w:abstractNum>
-  <w:abstractNum w:abstractNumId="49" w15:restartNumberingAfterBreak="0">
+  <w:abstractNum w:abstractNumId="53" w15:restartNumberingAfterBreak="0">
+    <w:nsid w:val="65BB71D0"/>
+    <w:multiLevelType w:val="multilevel"/>
+    <w:tmpl w:val="0FA6B50A"/>
+    <w:lvl w:ilvl="0">
+      <w:start w:val="1"/>
+      <w:numFmt w:val="bullet"/>
+      <w:lvlText w:val=""/>
+      <w:lvlJc w:val="left"/>
+      <w:pPr>
+        <w:tabs>
+          <w:tab w:val="num" w:pos="720"/>
+        </w:tabs>
+        <w:ind w:left="720" w:hanging="360"/>
+      </w:pPr>
+      <w:rPr>
+        <w:rFonts w:ascii="Symbol" w:hAnsi="Symbol" w:hint="default"/>
+        <w:sz w:val="20"/>
+      </w:rPr>
+    </w:lvl>
+    <w:lvl w:ilvl="1" w:tentative="1">
+      <w:start w:val="1"/>
+      <w:numFmt w:val="bullet"/>
+      <w:lvlText w:val="o"/>
+      <w:lvlJc w:val="left"/>
+      <w:pPr>
+        <w:tabs>
+          <w:tab w:val="num" w:pos="1440"/>
+        </w:tabs>
+        <w:ind w:left="1440" w:hanging="360"/>
+      </w:pPr>
+      <w:rPr>
+        <w:rFonts w:ascii="Courier New" w:hAnsi="Courier New" w:hint="default"/>
+        <w:sz w:val="20"/>
+      </w:rPr>
+    </w:lvl>
+    <w:lvl w:ilvl="2" w:tentative="1">
+      <w:start w:val="1"/>
+      <w:numFmt w:val="bullet"/>
+      <w:lvlText w:val=""/>
+      <w:lvlJc w:val="left"/>
+      <w:pPr>
+        <w:tabs>
+          <w:tab w:val="num" w:pos="2160"/>
+        </w:tabs>
+        <w:ind w:left="2160" w:hanging="360"/>
+      </w:pPr>
+      <w:rPr>
+        <w:rFonts w:ascii="Wingdings" w:hAnsi="Wingdings" w:hint="default"/>
+        <w:sz w:val="20"/>
+      </w:rPr>
+    </w:lvl>
+    <w:lvl w:ilvl="3" w:tentative="1">
+      <w:start w:val="1"/>
+      <w:numFmt w:val="bullet"/>
+      <w:lvlText w:val=""/>
+      <w:lvlJc w:val="left"/>
+      <w:pPr>
+        <w:tabs>
+          <w:tab w:val="num" w:pos="2880"/>
+        </w:tabs>
+        <w:ind w:left="2880" w:hanging="360"/>
+      </w:pPr>
+      <w:rPr>
+        <w:rFonts w:ascii="Wingdings" w:hAnsi="Wingdings" w:hint="default"/>
+        <w:sz w:val="20"/>
+      </w:rPr>
+    </w:lvl>
+    <w:lvl w:ilvl="4" w:tentative="1">
+      <w:start w:val="1"/>
+      <w:numFmt w:val="bullet"/>
+      <w:lvlText w:val=""/>
+      <w:lvlJc w:val="left"/>
+      <w:pPr>
+        <w:tabs>
+          <w:tab w:val="num" w:pos="3600"/>
+        </w:tabs>
+        <w:ind w:left="3600" w:hanging="360"/>
+      </w:pPr>
+      <w:rPr>
+        <w:rFonts w:ascii="Wingdings" w:hAnsi="Wingdings" w:hint="default"/>
+        <w:sz w:val="20"/>
+      </w:rPr>
+    </w:lvl>
+    <w:lvl w:ilvl="5" w:tentative="1">
+      <w:start w:val="1"/>
+      <w:numFmt w:val="bullet"/>
+      <w:lvlText w:val=""/>
+      <w:lvlJc w:val="left"/>
+      <w:pPr>
+        <w:tabs>
+          <w:tab w:val="num" w:pos="4320"/>
+        </w:tabs>
+        <w:ind w:left="4320" w:hanging="360"/>
+      </w:pPr>
+      <w:rPr>
+        <w:rFonts w:ascii="Wingdings" w:hAnsi="Wingdings" w:hint="default"/>
+        <w:sz w:val="20"/>
+      </w:rPr>
+    </w:lvl>
+    <w:lvl w:ilvl="6" w:tentative="1">
+      <w:start w:val="1"/>
+      <w:numFmt w:val="bullet"/>
+      <w:lvlText w:val=""/>
+      <w:lvlJc w:val="left"/>
+      <w:pPr>
+        <w:tabs>
+          <w:tab w:val="num" w:pos="5040"/>
+        </w:tabs>
+        <w:ind w:left="5040" w:hanging="360"/>
+      </w:pPr>
+      <w:rPr>
+        <w:rFonts w:ascii="Wingdings" w:hAnsi="Wingdings" w:hint="default"/>
+        <w:sz w:val="20"/>
+      </w:rPr>
+    </w:lvl>
+    <w:lvl w:ilvl="7" w:tentative="1">
+      <w:start w:val="1"/>
+      <w:numFmt w:val="bullet"/>
+      <w:lvlText w:val=""/>
+      <w:lvlJc w:val="left"/>
+      <w:pPr>
+        <w:tabs>
+          <w:tab w:val="num" w:pos="5760"/>
+        </w:tabs>
+        <w:ind w:left="5760" w:hanging="360"/>
+      </w:pPr>
+      <w:rPr>
+        <w:rFonts w:ascii="Wingdings" w:hAnsi="Wingdings" w:hint="default"/>
+        <w:sz w:val="20"/>
+      </w:rPr>
+    </w:lvl>
+    <w:lvl w:ilvl="8" w:tentative="1">
+      <w:start w:val="1"/>
+      <w:numFmt w:val="bullet"/>
+      <w:lvlText w:val=""/>
+      <w:lvlJc w:val="left"/>
+      <w:pPr>
+        <w:tabs>
+          <w:tab w:val="num" w:pos="6480"/>
+        </w:tabs>
+        <w:ind w:left="6480" w:hanging="360"/>
+      </w:pPr>
+      <w:rPr>
+        <w:rFonts w:ascii="Wingdings" w:hAnsi="Wingdings" w:hint="default"/>
+        <w:sz w:val="20"/>
+      </w:rPr>
+    </w:lvl>
+  </w:abstractNum>
+  <w:abstractNum w:abstractNumId="54" w15:restartNumberingAfterBreak="0">
     <w:nsid w:val="65C616B2"/>
     <w:multiLevelType w:val="multilevel"/>
     <w:tmpl w:val="9C502A7C"/>
@@ -12019,7 +13385,7 @@
       </w:rPr>
     </w:lvl>
   </w:abstractNum>
-  <w:abstractNum w:abstractNumId="50" w15:restartNumberingAfterBreak="0">
+  <w:abstractNum w:abstractNumId="55" w15:restartNumberingAfterBreak="0">
     <w:nsid w:val="66F05843"/>
     <w:multiLevelType w:val="multilevel"/>
     <w:tmpl w:val="A552BCF0"/>
@@ -12168,7 +13534,7 @@
       </w:rPr>
     </w:lvl>
   </w:abstractNum>
-  <w:abstractNum w:abstractNumId="51" w15:restartNumberingAfterBreak="0">
+  <w:abstractNum w:abstractNumId="56" w15:restartNumberingAfterBreak="0">
     <w:nsid w:val="679A45CC"/>
     <w:multiLevelType w:val="multilevel"/>
     <w:tmpl w:val="B25E3482"/>
@@ -12317,7 +13683,7 @@
       </w:rPr>
     </w:lvl>
   </w:abstractNum>
-  <w:abstractNum w:abstractNumId="52" w15:restartNumberingAfterBreak="0">
+  <w:abstractNum w:abstractNumId="57" w15:restartNumberingAfterBreak="0">
     <w:nsid w:val="68512AE3"/>
     <w:multiLevelType w:val="multilevel"/>
     <w:tmpl w:val="EDEE77CA"/>
@@ -12466,7 +13832,156 @@
       </w:rPr>
     </w:lvl>
   </w:abstractNum>
-  <w:abstractNum w:abstractNumId="53" w15:restartNumberingAfterBreak="0">
+  <w:abstractNum w:abstractNumId="58" w15:restartNumberingAfterBreak="0">
+    <w:nsid w:val="69510C37"/>
+    <w:multiLevelType w:val="multilevel"/>
+    <w:tmpl w:val="A344F79E"/>
+    <w:lvl w:ilvl="0">
+      <w:start w:val="1"/>
+      <w:numFmt w:val="bullet"/>
+      <w:lvlText w:val=""/>
+      <w:lvlJc w:val="left"/>
+      <w:pPr>
+        <w:tabs>
+          <w:tab w:val="num" w:pos="720"/>
+        </w:tabs>
+        <w:ind w:left="720" w:hanging="360"/>
+      </w:pPr>
+      <w:rPr>
+        <w:rFonts w:ascii="Symbol" w:hAnsi="Symbol" w:hint="default"/>
+        <w:sz w:val="20"/>
+      </w:rPr>
+    </w:lvl>
+    <w:lvl w:ilvl="1" w:tentative="1">
+      <w:start w:val="1"/>
+      <w:numFmt w:val="bullet"/>
+      <w:lvlText w:val="o"/>
+      <w:lvlJc w:val="left"/>
+      <w:pPr>
+        <w:tabs>
+          <w:tab w:val="num" w:pos="1440"/>
+        </w:tabs>
+        <w:ind w:left="1440" w:hanging="360"/>
+      </w:pPr>
+      <w:rPr>
+        <w:rFonts w:ascii="Courier New" w:hAnsi="Courier New" w:hint="default"/>
+        <w:sz w:val="20"/>
+      </w:rPr>
+    </w:lvl>
+    <w:lvl w:ilvl="2" w:tentative="1">
+      <w:start w:val="1"/>
+      <w:numFmt w:val="bullet"/>
+      <w:lvlText w:val=""/>
+      <w:lvlJc w:val="left"/>
+      <w:pPr>
+        <w:tabs>
+          <w:tab w:val="num" w:pos="2160"/>
+        </w:tabs>
+        <w:ind w:left="2160" w:hanging="360"/>
+      </w:pPr>
+      <w:rPr>
+        <w:rFonts w:ascii="Wingdings" w:hAnsi="Wingdings" w:hint="default"/>
+        <w:sz w:val="20"/>
+      </w:rPr>
+    </w:lvl>
+    <w:lvl w:ilvl="3" w:tentative="1">
+      <w:start w:val="1"/>
+      <w:numFmt w:val="bullet"/>
+      <w:lvlText w:val=""/>
+      <w:lvlJc w:val="left"/>
+      <w:pPr>
+        <w:tabs>
+          <w:tab w:val="num" w:pos="2880"/>
+        </w:tabs>
+        <w:ind w:left="2880" w:hanging="360"/>
+      </w:pPr>
+      <w:rPr>
+        <w:rFonts w:ascii="Wingdings" w:hAnsi="Wingdings" w:hint="default"/>
+        <w:sz w:val="20"/>
+      </w:rPr>
+    </w:lvl>
+    <w:lvl w:ilvl="4" w:tentative="1">
+      <w:start w:val="1"/>
+      <w:numFmt w:val="bullet"/>
+      <w:lvlText w:val=""/>
+      <w:lvlJc w:val="left"/>
+      <w:pPr>
+        <w:tabs>
+          <w:tab w:val="num" w:pos="3600"/>
+        </w:tabs>
+        <w:ind w:left="3600" w:hanging="360"/>
+      </w:pPr>
+      <w:rPr>
+        <w:rFonts w:ascii="Wingdings" w:hAnsi="Wingdings" w:hint="default"/>
+        <w:sz w:val="20"/>
+      </w:rPr>
+    </w:lvl>
+    <w:lvl w:ilvl="5" w:tentative="1">
+      <w:start w:val="1"/>
+      <w:numFmt w:val="bullet"/>
+      <w:lvlText w:val=""/>
+      <w:lvlJc w:val="left"/>
+      <w:pPr>
+        <w:tabs>
+          <w:tab w:val="num" w:pos="4320"/>
+        </w:tabs>
+        <w:ind w:left="4320" w:hanging="360"/>
+      </w:pPr>
+      <w:rPr>
+        <w:rFonts w:ascii="Wingdings" w:hAnsi="Wingdings" w:hint="default"/>
+        <w:sz w:val="20"/>
+      </w:rPr>
+    </w:lvl>
+    <w:lvl w:ilvl="6" w:tentative="1">
+      <w:start w:val="1"/>
+      <w:numFmt w:val="bullet"/>
+      <w:lvlText w:val=""/>
+      <w:lvlJc w:val="left"/>
+      <w:pPr>
+        <w:tabs>
+          <w:tab w:val="num" w:pos="5040"/>
+        </w:tabs>
+        <w:ind w:left="5040" w:hanging="360"/>
+      </w:pPr>
+      <w:rPr>
+        <w:rFonts w:ascii="Wingdings" w:hAnsi="Wingdings" w:hint="default"/>
+        <w:sz w:val="20"/>
+      </w:rPr>
+    </w:lvl>
+    <w:lvl w:ilvl="7" w:tentative="1">
+      <w:start w:val="1"/>
+      <w:numFmt w:val="bullet"/>
+      <w:lvlText w:val=""/>
+      <w:lvlJc w:val="left"/>
+      <w:pPr>
+        <w:tabs>
+          <w:tab w:val="num" w:pos="5760"/>
+        </w:tabs>
+        <w:ind w:left="5760" w:hanging="360"/>
+      </w:pPr>
+      <w:rPr>
+        <w:rFonts w:ascii="Wingdings" w:hAnsi="Wingdings" w:hint="default"/>
+        <w:sz w:val="20"/>
+      </w:rPr>
+    </w:lvl>
+    <w:lvl w:ilvl="8" w:tentative="1">
+      <w:start w:val="1"/>
+      <w:numFmt w:val="bullet"/>
+      <w:lvlText w:val=""/>
+      <w:lvlJc w:val="left"/>
+      <w:pPr>
+        <w:tabs>
+          <w:tab w:val="num" w:pos="6480"/>
+        </w:tabs>
+        <w:ind w:left="6480" w:hanging="360"/>
+      </w:pPr>
+      <w:rPr>
+        <w:rFonts w:ascii="Wingdings" w:hAnsi="Wingdings" w:hint="default"/>
+        <w:sz w:val="20"/>
+      </w:rPr>
+    </w:lvl>
+  </w:abstractNum>
+  <w:abstractNum w:abstractNumId="59" w15:restartNumberingAfterBreak="0">
     <w:nsid w:val="6EF905C2"/>
     <w:multiLevelType w:val="multilevel"/>
     <w:tmpl w:val="36EEBDD2"/>
@@ -12615,7 +14130,7 @@
       </w:rPr>
     </w:lvl>
   </w:abstractNum>
-  <w:abstractNum w:abstractNumId="54" w15:restartNumberingAfterBreak="0">
+  <w:abstractNum w:abstractNumId="60" w15:restartNumberingAfterBreak="0">
     <w:nsid w:val="744962F7"/>
     <w:multiLevelType w:val="multilevel"/>
     <w:tmpl w:val="B76AF33E"/>
@@ -12764,7 +14279,7 @@
       </w:rPr>
     </w:lvl>
   </w:abstractNum>
-  <w:abstractNum w:abstractNumId="55" w15:restartNumberingAfterBreak="0">
+  <w:abstractNum w:abstractNumId="61" w15:restartNumberingAfterBreak="0">
     <w:nsid w:val="79917741"/>
     <w:multiLevelType w:val="multilevel"/>
     <w:tmpl w:val="B0343710"/>
@@ -12913,7 +14428,7 @@
       </w:rPr>
     </w:lvl>
   </w:abstractNum>
-  <w:abstractNum w:abstractNumId="56" w15:restartNumberingAfterBreak="0">
+  <w:abstractNum w:abstractNumId="62" w15:restartNumberingAfterBreak="0">
     <w:nsid w:val="7B5B166E"/>
     <w:multiLevelType w:val="multilevel"/>
     <w:tmpl w:val="496413C6"/>
@@ -13062,7 +14577,7 @@
       </w:rPr>
     </w:lvl>
   </w:abstractNum>
-  <w:abstractNum w:abstractNumId="57" w15:restartNumberingAfterBreak="0">
+  <w:abstractNum w:abstractNumId="63" w15:restartNumberingAfterBreak="0">
     <w:nsid w:val="7BC21CE9"/>
     <w:multiLevelType w:val="multilevel"/>
     <w:tmpl w:val="99C48CE4"/>
@@ -13211,7 +14726,7 @@
       </w:rPr>
     </w:lvl>
   </w:abstractNum>
-  <w:abstractNum w:abstractNumId="58" w15:restartNumberingAfterBreak="0">
+  <w:abstractNum w:abstractNumId="64" w15:restartNumberingAfterBreak="0">
     <w:nsid w:val="7D0C11B6"/>
     <w:multiLevelType w:val="multilevel"/>
     <w:tmpl w:val="5D002ACA"/>
@@ -13360,29 +14875,178 @@
       </w:rPr>
     </w:lvl>
   </w:abstractNum>
+  <w:abstractNum w:abstractNumId="65" w15:restartNumberingAfterBreak="0">
+    <w:nsid w:val="7DB26D11"/>
+    <w:multiLevelType w:val="multilevel"/>
+    <w:tmpl w:val="F32EE0BE"/>
+    <w:lvl w:ilvl="0">
+      <w:start w:val="1"/>
+      <w:numFmt w:val="bullet"/>
+      <w:lvlText w:val=""/>
+      <w:lvlJc w:val="left"/>
+      <w:pPr>
+        <w:tabs>
+          <w:tab w:val="num" w:pos="720"/>
+        </w:tabs>
+        <w:ind w:left="720" w:hanging="360"/>
+      </w:pPr>
+      <w:rPr>
+        <w:rFonts w:ascii="Symbol" w:hAnsi="Symbol" w:hint="default"/>
+        <w:sz w:val="20"/>
+      </w:rPr>
+    </w:lvl>
+    <w:lvl w:ilvl="1">
+      <w:start w:val="1"/>
+      <w:numFmt w:val="bullet"/>
+      <w:lvlText w:val="o"/>
+      <w:lvlJc w:val="left"/>
+      <w:pPr>
+        <w:tabs>
+          <w:tab w:val="num" w:pos="1440"/>
+        </w:tabs>
+        <w:ind w:left="1440" w:hanging="360"/>
+      </w:pPr>
+      <w:rPr>
+        <w:rFonts w:ascii="Courier New" w:hAnsi="Courier New" w:hint="default"/>
+        <w:sz w:val="20"/>
+      </w:rPr>
+    </w:lvl>
+    <w:lvl w:ilvl="2" w:tentative="1">
+      <w:start w:val="1"/>
+      <w:numFmt w:val="bullet"/>
+      <w:lvlText w:val=""/>
+      <w:lvlJc w:val="left"/>
+      <w:pPr>
+        <w:tabs>
+          <w:tab w:val="num" w:pos="2160"/>
+        </w:tabs>
+        <w:ind w:left="2160" w:hanging="360"/>
+      </w:pPr>
+      <w:rPr>
+        <w:rFonts w:ascii="Wingdings" w:hAnsi="Wingdings" w:hint="default"/>
+        <w:sz w:val="20"/>
+      </w:rPr>
+    </w:lvl>
+    <w:lvl w:ilvl="3" w:tentative="1">
+      <w:start w:val="1"/>
+      <w:numFmt w:val="bullet"/>
+      <w:lvlText w:val=""/>
+      <w:lvlJc w:val="left"/>
+      <w:pPr>
+        <w:tabs>
+          <w:tab w:val="num" w:pos="2880"/>
+        </w:tabs>
+        <w:ind w:left="2880" w:hanging="360"/>
+      </w:pPr>
+      <w:rPr>
+        <w:rFonts w:ascii="Wingdings" w:hAnsi="Wingdings" w:hint="default"/>
+        <w:sz w:val="20"/>
+      </w:rPr>
+    </w:lvl>
+    <w:lvl w:ilvl="4" w:tentative="1">
+      <w:start w:val="1"/>
+      <w:numFmt w:val="bullet"/>
+      <w:lvlText w:val=""/>
+      <w:lvlJc w:val="left"/>
+      <w:pPr>
+        <w:tabs>
+          <w:tab w:val="num" w:pos="3600"/>
+        </w:tabs>
+        <w:ind w:left="3600" w:hanging="360"/>
+      </w:pPr>
+      <w:rPr>
+        <w:rFonts w:ascii="Wingdings" w:hAnsi="Wingdings" w:hint="default"/>
+        <w:sz w:val="20"/>
+      </w:rPr>
+    </w:lvl>
+    <w:lvl w:ilvl="5" w:tentative="1">
+      <w:start w:val="1"/>
+      <w:numFmt w:val="bullet"/>
+      <w:lvlText w:val=""/>
+      <w:lvlJc w:val="left"/>
+      <w:pPr>
+        <w:tabs>
+          <w:tab w:val="num" w:pos="4320"/>
+        </w:tabs>
+        <w:ind w:left="4320" w:hanging="360"/>
+      </w:pPr>
+      <w:rPr>
+        <w:rFonts w:ascii="Wingdings" w:hAnsi="Wingdings" w:hint="default"/>
+        <w:sz w:val="20"/>
+      </w:rPr>
+    </w:lvl>
+    <w:lvl w:ilvl="6" w:tentative="1">
+      <w:start w:val="1"/>
+      <w:numFmt w:val="bullet"/>
+      <w:lvlText w:val=""/>
+      <w:lvlJc w:val="left"/>
+      <w:pPr>
+        <w:tabs>
+          <w:tab w:val="num" w:pos="5040"/>
+        </w:tabs>
+        <w:ind w:left="5040" w:hanging="360"/>
+      </w:pPr>
+      <w:rPr>
+        <w:rFonts w:ascii="Wingdings" w:hAnsi="Wingdings" w:hint="default"/>
+        <w:sz w:val="20"/>
+      </w:rPr>
+    </w:lvl>
+    <w:lvl w:ilvl="7" w:tentative="1">
+      <w:start w:val="1"/>
+      <w:numFmt w:val="bullet"/>
+      <w:lvlText w:val=""/>
+      <w:lvlJc w:val="left"/>
+      <w:pPr>
+        <w:tabs>
+          <w:tab w:val="num" w:pos="5760"/>
+        </w:tabs>
+        <w:ind w:left="5760" w:hanging="360"/>
+      </w:pPr>
+      <w:rPr>
+        <w:rFonts w:ascii="Wingdings" w:hAnsi="Wingdings" w:hint="default"/>
+        <w:sz w:val="20"/>
+      </w:rPr>
+    </w:lvl>
+    <w:lvl w:ilvl="8" w:tentative="1">
+      <w:start w:val="1"/>
+      <w:numFmt w:val="bullet"/>
+      <w:lvlText w:val=""/>
+      <w:lvlJc w:val="left"/>
+      <w:pPr>
+        <w:tabs>
+          <w:tab w:val="num" w:pos="6480"/>
+        </w:tabs>
+        <w:ind w:left="6480" w:hanging="360"/>
+      </w:pPr>
+      <w:rPr>
+        <w:rFonts w:ascii="Wingdings" w:hAnsi="Wingdings" w:hint="default"/>
+        <w:sz w:val="20"/>
+      </w:rPr>
+    </w:lvl>
+  </w:abstractNum>
   <w:num w:numId="1" w16cid:durableId="478348329">
-    <w:abstractNumId w:val="24"/>
+    <w:abstractNumId w:val="25"/>
   </w:num>
   <w:num w:numId="2" w16cid:durableId="2147239624">
-    <w:abstractNumId w:val="52"/>
+    <w:abstractNumId w:val="57"/>
   </w:num>
   <w:num w:numId="3" w16cid:durableId="712850290">
     <w:abstractNumId w:val="20"/>
   </w:num>
   <w:num w:numId="4" w16cid:durableId="551158125">
-    <w:abstractNumId w:val="36"/>
+    <w:abstractNumId w:val="39"/>
   </w:num>
   <w:num w:numId="5" w16cid:durableId="314844509">
-    <w:abstractNumId w:val="21"/>
+    <w:abstractNumId w:val="22"/>
   </w:num>
   <w:num w:numId="6" w16cid:durableId="1094790166">
     <w:abstractNumId w:val="8"/>
   </w:num>
   <w:num w:numId="7" w16cid:durableId="2113821286">
-    <w:abstractNumId w:val="56"/>
+    <w:abstractNumId w:val="62"/>
   </w:num>
   <w:num w:numId="8" w16cid:durableId="925383513">
-    <w:abstractNumId w:val="33"/>
+    <w:abstractNumId w:val="36"/>
   </w:num>
   <w:num w:numId="9" w16cid:durableId="339963801">
     <w:abstractNumId w:val="3"/>
@@ -13394,46 +15058,46 @@
     <w:abstractNumId w:val="11"/>
   </w:num>
   <w:num w:numId="12" w16cid:durableId="324015709">
-    <w:abstractNumId w:val="48"/>
+    <w:abstractNumId w:val="52"/>
   </w:num>
   <w:num w:numId="13" w16cid:durableId="608009490">
     <w:abstractNumId w:val="13"/>
   </w:num>
   <w:num w:numId="14" w16cid:durableId="1511140894">
-    <w:abstractNumId w:val="51"/>
+    <w:abstractNumId w:val="56"/>
   </w:num>
   <w:num w:numId="15" w16cid:durableId="700784843">
-    <w:abstractNumId w:val="49"/>
+    <w:abstractNumId w:val="54"/>
   </w:num>
   <w:num w:numId="16" w16cid:durableId="964196940">
-    <w:abstractNumId w:val="32"/>
+    <w:abstractNumId w:val="35"/>
   </w:num>
   <w:num w:numId="17" w16cid:durableId="623267196">
     <w:abstractNumId w:val="7"/>
   </w:num>
   <w:num w:numId="18" w16cid:durableId="813176617">
-    <w:abstractNumId w:val="41"/>
+    <w:abstractNumId w:val="44"/>
   </w:num>
   <w:num w:numId="19" w16cid:durableId="1669013200">
     <w:abstractNumId w:val="1"/>
   </w:num>
   <w:num w:numId="20" w16cid:durableId="172844941">
-    <w:abstractNumId w:val="37"/>
+    <w:abstractNumId w:val="40"/>
   </w:num>
   <w:num w:numId="21" w16cid:durableId="920679285">
-    <w:abstractNumId w:val="38"/>
+    <w:abstractNumId w:val="41"/>
   </w:num>
   <w:num w:numId="22" w16cid:durableId="1547527196">
     <w:abstractNumId w:val="14"/>
   </w:num>
   <w:num w:numId="23" w16cid:durableId="2075159554">
-    <w:abstractNumId w:val="47"/>
+    <w:abstractNumId w:val="51"/>
   </w:num>
   <w:num w:numId="24" w16cid:durableId="1040742706">
-    <w:abstractNumId w:val="34"/>
+    <w:abstractNumId w:val="37"/>
   </w:num>
   <w:num w:numId="25" w16cid:durableId="1196580033">
-    <w:abstractNumId w:val="35"/>
+    <w:abstractNumId w:val="38"/>
   </w:num>
   <w:num w:numId="26" w16cid:durableId="2014647944">
     <w:abstractNumId w:val="17"/>
@@ -13442,70 +15106,70 @@
     <w:abstractNumId w:val="10"/>
   </w:num>
   <w:num w:numId="28" w16cid:durableId="537395828">
+    <w:abstractNumId w:val="49"/>
+  </w:num>
+  <w:num w:numId="29" w16cid:durableId="1833521823">
+    <w:abstractNumId w:val="43"/>
+  </w:num>
+  <w:num w:numId="30" w16cid:durableId="936056232">
     <w:abstractNumId w:val="46"/>
   </w:num>
-  <w:num w:numId="29" w16cid:durableId="1833521823">
-    <w:abstractNumId w:val="40"/>
-  </w:num>
-  <w:num w:numId="30" w16cid:durableId="936056232">
-    <w:abstractNumId w:val="43"/>
-  </w:num>
   <w:num w:numId="31" w16cid:durableId="1973094109">
-    <w:abstractNumId w:val="55"/>
+    <w:abstractNumId w:val="61"/>
   </w:num>
   <w:num w:numId="32" w16cid:durableId="1954244361">
-    <w:abstractNumId w:val="58"/>
+    <w:abstractNumId w:val="64"/>
   </w:num>
   <w:num w:numId="33" w16cid:durableId="1803425760">
     <w:abstractNumId w:val="15"/>
   </w:num>
   <w:num w:numId="34" w16cid:durableId="1584222628">
-    <w:abstractNumId w:val="25"/>
+    <w:abstractNumId w:val="26"/>
   </w:num>
   <w:num w:numId="35" w16cid:durableId="554463756">
-    <w:abstractNumId w:val="45"/>
+    <w:abstractNumId w:val="48"/>
   </w:num>
   <w:num w:numId="36" w16cid:durableId="413668055">
     <w:abstractNumId w:val="5"/>
   </w:num>
   <w:num w:numId="37" w16cid:durableId="310402924">
-    <w:abstractNumId w:val="31"/>
+    <w:abstractNumId w:val="33"/>
   </w:num>
   <w:num w:numId="38" w16cid:durableId="2051413309">
     <w:abstractNumId w:val="4"/>
   </w:num>
   <w:num w:numId="39" w16cid:durableId="387731301">
-    <w:abstractNumId w:val="54"/>
+    <w:abstractNumId w:val="60"/>
   </w:num>
   <w:num w:numId="40" w16cid:durableId="1227229652">
     <w:abstractNumId w:val="6"/>
   </w:num>
   <w:num w:numId="41" w16cid:durableId="99301617">
-    <w:abstractNumId w:val="22"/>
+    <w:abstractNumId w:val="23"/>
   </w:num>
   <w:num w:numId="42" w16cid:durableId="1735079099">
     <w:abstractNumId w:val="19"/>
   </w:num>
   <w:num w:numId="43" w16cid:durableId="1456681235">
-    <w:abstractNumId w:val="26"/>
+    <w:abstractNumId w:val="27"/>
   </w:num>
   <w:num w:numId="44" w16cid:durableId="1743914605">
-    <w:abstractNumId w:val="50"/>
+    <w:abstractNumId w:val="55"/>
   </w:num>
   <w:num w:numId="45" w16cid:durableId="688218800">
-    <w:abstractNumId w:val="28"/>
+    <w:abstractNumId w:val="29"/>
   </w:num>
   <w:num w:numId="46" w16cid:durableId="1418135355">
-    <w:abstractNumId w:val="29"/>
+    <w:abstractNumId w:val="30"/>
   </w:num>
   <w:num w:numId="47" w16cid:durableId="745424412">
     <w:abstractNumId w:val="18"/>
   </w:num>
   <w:num w:numId="48" w16cid:durableId="435101332">
-    <w:abstractNumId w:val="44"/>
+    <w:abstractNumId w:val="47"/>
   </w:num>
   <w:num w:numId="49" w16cid:durableId="854463395">
-    <w:abstractNumId w:val="30"/>
+    <w:abstractNumId w:val="31"/>
   </w:num>
   <w:num w:numId="50" w16cid:durableId="996882675">
     <w:abstractNumId w:val="12"/>
@@ -13517,27 +15181,48 @@
     <w:abstractNumId w:val="9"/>
   </w:num>
   <w:num w:numId="53" w16cid:durableId="1024163150">
-    <w:abstractNumId w:val="27"/>
+    <w:abstractNumId w:val="28"/>
   </w:num>
   <w:num w:numId="54" w16cid:durableId="1548101555">
-    <w:abstractNumId w:val="53"/>
+    <w:abstractNumId w:val="59"/>
   </w:num>
   <w:num w:numId="55" w16cid:durableId="1700626182">
-    <w:abstractNumId w:val="23"/>
+    <w:abstractNumId w:val="24"/>
   </w:num>
   <w:num w:numId="56" w16cid:durableId="1464884695">
+    <w:abstractNumId w:val="45"/>
+  </w:num>
+  <w:num w:numId="57" w16cid:durableId="79301541">
     <w:abstractNumId w:val="42"/>
   </w:num>
-  <w:num w:numId="57" w16cid:durableId="79301541">
-    <w:abstractNumId w:val="39"/>
-  </w:num>
   <w:num w:numId="58" w16cid:durableId="972948326">
-    <w:abstractNumId w:val="57"/>
+    <w:abstractNumId w:val="63"/>
   </w:num>
   <w:num w:numId="59" w16cid:durableId="645400013">
     <w:abstractNumId w:val="16"/>
   </w:num>
-  <w:numIdMacAtCleanup w:val="52"/>
+  <w:num w:numId="60" w16cid:durableId="546794530">
+    <w:abstractNumId w:val="32"/>
+  </w:num>
+  <w:num w:numId="61" w16cid:durableId="141852626">
+    <w:abstractNumId w:val="21"/>
+  </w:num>
+  <w:num w:numId="62" w16cid:durableId="2056586008">
+    <w:abstractNumId w:val="50"/>
+  </w:num>
+  <w:num w:numId="63" w16cid:durableId="1866628096">
+    <w:abstractNumId w:val="53"/>
+  </w:num>
+  <w:num w:numId="64" w16cid:durableId="295259160">
+    <w:abstractNumId w:val="58"/>
+  </w:num>
+  <w:num w:numId="65" w16cid:durableId="941887243">
+    <w:abstractNumId w:val="65"/>
+  </w:num>
+  <w:num w:numId="66" w16cid:durableId="1386106555">
+    <w:abstractNumId w:val="34"/>
+  </w:num>
+  <w:numIdMacAtCleanup w:val="66"/>
 </w:numbering>
 </file>
 

</xml_diff>